<commit_message>
Adds problem to project proposal and solution
</commit_message>
<xml_diff>
--- a/Research.docx
+++ b/Research.docx
@@ -16,7 +16,31 @@
           <w:sz w:val="40"/>
           <w:szCs w:val="40"/>
         </w:rPr>
-        <w:t>Research</w:t>
+        <w:t>Project Proposal</w:t>
+      </w:r>
+    </w:p>
+    <w:p>
+      <w:pPr>
+        <w:rPr>
+          <w:b/>
+          <w:bCs/>
+          <w:sz w:val="32"/>
+          <w:szCs w:val="32"/>
+        </w:rPr>
+      </w:pPr>
+      <w:r>
+        <w:rPr>
+          <w:b/>
+          <w:bCs/>
+          <w:sz w:val="32"/>
+          <w:szCs w:val="32"/>
+        </w:rPr>
+        <w:t>Motivation</w:t>
+      </w:r>
+    </w:p>
+    <w:p>
+      <w:r>
+        <w:t>Accurate and localized rain prediction is crucial for various sectors, including agriculture, urban planning, and disaster preparedness. Many developing countries and hard-to-reach areas worldwide lack the resources to implement radar systems for granular and precise weather forecasts. A basic Doppler radar system can cost between $300,000 and $500,000, with more advanced models costing $1 million or more (excluding maintenance and operational costs). In contrast, a basic commercial weather system costs between $2,000 and $5,000+ for advanced models. Therefore, this project aims to develop and explore a much cheaper and more accessible solution by leveraging artificial intelligence, spatial interpolation, and data from commercial weather systems, addressing a critical need for many countries and data-sparse regions around the world.</w:t>
       </w:r>
     </w:p>
     <w:p/>
@@ -39,15 +63,7 @@
     </w:p>
     <w:p>
       <w:r>
-        <w:t xml:space="preserve">The proposed </w:t>
-      </w:r>
-      <w:proofErr w:type="spellStart"/>
-      <w:r>
-        <w:t>Spatio</w:t>
-      </w:r>
-      <w:proofErr w:type="spellEnd"/>
-      <w:r>
-        <w:t xml:space="preserve">-Temporal Precipitation Forecasting pipeline is based on the </w:t>
+        <w:t xml:space="preserve">The proposed Spatio-Temporal Precipitation Forecasting pipeline is based on the </w:t>
       </w:r>
       <w:r>
         <w:rPr>
@@ -64,6 +80,7 @@
           <w:id w:val="-1644965095"/>
           <w:citation/>
         </w:sdtPr>
+        <w:sdtEndPr/>
         <w:sdtContent>
           <w:r>
             <w:fldChar w:fldCharType="begin"/>
@@ -140,11 +157,9 @@
       <w:r>
         <w:t>(</w:t>
       </w:r>
-      <w:proofErr w:type="spellStart"/>
       <w:r>
         <w:t>RFsp</w:t>
       </w:r>
-      <w:proofErr w:type="spellEnd"/>
       <w:r>
         <w:t>), making it ideal for generating high-resolution operational forecast maps.</w:t>
       </w:r>
@@ -176,25 +191,16 @@
       <w:r>
         <w:t xml:space="preserve"> (</w:t>
       </w:r>
-      <w:proofErr w:type="spellStart"/>
       <w:r>
         <w:t>Rain_at_Neighbor_k</w:t>
       </w:r>
-      <w:proofErr w:type="spellEnd"/>
-      <w:r>
-        <w:t xml:space="preserve">) directly as covariates. This approach, which mirrors the fundamental principle of geostatistical methods like Kriging, was previously overlooked in other </w:t>
-      </w:r>
-      <w:proofErr w:type="gramStart"/>
-      <w:r>
-        <w:t>machine</w:t>
-      </w:r>
-      <w:proofErr w:type="gramEnd"/>
-      <w:r>
-        <w:t xml:space="preserve"> learning spatial models. This feature design allows the model to inherently learn and non-linearly map the localized spatial autocorrelation, which is essential for accurate interpolation.</w:t>
-      </w:r>
-    </w:p>
-    <w:p>
-      <w:r>
+      <w:r>
+        <w:t>) directly as covariates. This approach, which mirrors the fundamental principle of geostatistical methods like Kriging, was previously overlooked in other machine learning spatial models. This feature design allows the model to inherently learn and non-linearly map the localized spatial autocorrelation, which is essential for accurate interpolation.</w:t>
+      </w:r>
+    </w:p>
+    <w:p>
+      <w:r>
+        <w:lastRenderedPageBreak/>
         <w:t xml:space="preserve">This framework provides the </w:t>
       </w:r>
       <w:r>
@@ -269,7 +275,6 @@
           <w:b/>
           <w:bCs/>
         </w:rPr>
-        <w:lastRenderedPageBreak/>
         <w:t xml:space="preserve">Explanation of </w:t>
       </w:r>
       <w:r>
@@ -289,7 +294,7 @@
     </w:p>
     <w:p>
       <w:r>
-        <w:t>1) Feature vector for each station S includes:</w:t>
+        <w:t>Feature vector for each station S includes:</w:t>
       </w:r>
     </w:p>
     <w:p>
@@ -313,31 +318,7 @@
         </w:numPr>
       </w:pPr>
       <w:r>
-        <w:t xml:space="preserve">Static Features: </w:t>
-      </w:r>
-      <w:proofErr w:type="spellStart"/>
-      <w:r>
-        <w:t>DEM_at_S</w:t>
-      </w:r>
-      <w:proofErr w:type="spellEnd"/>
-      <w:r>
-        <w:t xml:space="preserve">, </w:t>
-      </w:r>
-      <w:proofErr w:type="spellStart"/>
-      <w:r>
-        <w:t>Slope_at_S</w:t>
-      </w:r>
-      <w:proofErr w:type="spellEnd"/>
-      <w:r>
-        <w:t xml:space="preserve">, </w:t>
-      </w:r>
-      <w:proofErr w:type="spellStart"/>
-      <w:r>
-        <w:t>Dist_to_Coast_S</w:t>
-      </w:r>
-      <w:proofErr w:type="spellEnd"/>
-      <w:r>
-        <w:t>.</w:t>
+        <w:t>Static Features: DEM_at_S, Slope_at_S, Dist_to_Coast_S.</w:t>
       </w:r>
     </w:p>
     <w:p>
@@ -354,26 +335,12 @@
     </w:p>
     <w:p>
       <w:r>
-        <w:t>2)</w:t>
-      </w:r>
-      <w:r>
-        <w:t xml:space="preserve"> </w:t>
-      </w:r>
-      <w:r>
-        <w:t xml:space="preserve">Train the Random Forest or </w:t>
-      </w:r>
-      <w:proofErr w:type="spellStart"/>
-      <w:r>
-        <w:t>XGBoost</w:t>
-      </w:r>
-      <w:proofErr w:type="spellEnd"/>
-      <w:r>
-        <w:t xml:space="preserve"> on a dataset of the combined station's data so that the models learn the complex relationship between the physical features, time lags, and the local spatial context.</w:t>
-      </w:r>
-    </w:p>
-    <w:p>
-      <w:r>
-        <w:t>3) Create a feature grid where each cell would have the same length feature vector as the stations the model was trained on:</w:t>
+        <w:t>Train the Random Forest or XGBoost on a dataset of the combined station's data so that the models learn the complex relationship between the physical features, time lags, and the local spatial context.</w:t>
+      </w:r>
+    </w:p>
+    <w:p>
+      <w:r>
+        <w:t>Create a feature grid where each cell would have the same length feature vector as the stations the model was trained on:</w:t>
       </w:r>
     </w:p>
     <w:p>
@@ -403,29 +370,8 @@
         </w:numPr>
       </w:pPr>
       <w:r>
-        <w:t xml:space="preserve">Static Features: </w:t>
-      </w:r>
-      <w:proofErr w:type="spellStart"/>
-      <w:r>
-        <w:t>DEM_at_S</w:t>
-      </w:r>
-      <w:proofErr w:type="spellEnd"/>
-      <w:r>
-        <w:t xml:space="preserve">, </w:t>
-      </w:r>
-      <w:proofErr w:type="spellStart"/>
-      <w:r>
-        <w:t>Slope_at_S</w:t>
-      </w:r>
-      <w:proofErr w:type="spellEnd"/>
-      <w:r>
-        <w:t xml:space="preserve">, </w:t>
-      </w:r>
-      <w:proofErr w:type="spellStart"/>
-      <w:r>
-        <w:t>Dist_to_Coast_S</w:t>
-      </w:r>
-      <w:proofErr w:type="spellEnd"/>
+        <w:t>Static Features: DEM_at_S, Slope_at_S, Dist_to_Coast_S</w:t>
+      </w:r>
     </w:p>
     <w:p>
       <w:pPr>
@@ -456,20 +402,75 @@
     </w:p>
     <w:p>
       <w:r>
-        <w:t>4) Use the trained Random Forest/</w:t>
-      </w:r>
-      <w:proofErr w:type="spellStart"/>
-      <w:r>
-        <w:t>XGBoost</w:t>
-      </w:r>
-      <w:proofErr w:type="spellEnd"/>
-      <w:r>
-        <w:t xml:space="preserve"> model to predict the precipitation forecast for each cell on the grid.</w:t>
-      </w:r>
-    </w:p>
-    <w:p>
-      <w:r>
-        <w:t>5) Validate model performance by comparing its predictions on the stations against the measurements at the stations, also compare interpolated results by the ML model against a holdout station inside the interpolated grid to evaluate the accuracy of the interpolation.</w:t>
+        <w:t>Use the trained Random Forest/XGBoost model to predict the precipitation forecast for each cell on the grid.</w:t>
+      </w:r>
+    </w:p>
+    <w:p>
+      <w:r>
+        <w:t>Validate model performance by comparing its predictions on the stations against the measurements at the stations, also compare interpolated results by the ML model against a holdout station inside the interpolated grid to evaluate the accuracy of the interpolation.</w:t>
+      </w:r>
+    </w:p>
+    <w:p>
+      <w:pPr>
+        <w:rPr>
+          <w:b/>
+          <w:bCs/>
+          <w:sz w:val="32"/>
+          <w:szCs w:val="32"/>
+        </w:rPr>
+      </w:pPr>
+      <w:r>
+        <w:rPr>
+          <w:b/>
+          <w:bCs/>
+          <w:sz w:val="32"/>
+          <w:szCs w:val="32"/>
+        </w:rPr>
+        <w:lastRenderedPageBreak/>
+        <w:t>Problems</w:t>
+      </w:r>
+    </w:p>
+    <w:p>
+      <w:r>
+        <w:t>For the project I wanted to interpolate the weather data between the Nazareth, Afula and Iksal stations, after doing research on the available data of these stations it turns out that:</w:t>
+      </w:r>
+    </w:p>
+    <w:p>
+      <w:pPr>
+        <w:pStyle w:val="ListParagraph"/>
+        <w:numPr>
+          <w:ilvl w:val="0"/>
+          <w:numId w:val="6"/>
+        </w:numPr>
+      </w:pPr>
+      <w:r>
+        <w:t>Nazareth weather station only provides data from 10</w:t>
+      </w:r>
+      <w:r>
+        <w:rPr>
+          <w:vertAlign w:val="superscript"/>
+        </w:rPr>
+        <w:t>th</w:t>
+      </w:r>
+      <w:r>
+        <w:t xml:space="preserve"> of march 2024 up to the current date.</w:t>
+      </w:r>
+    </w:p>
+    <w:p>
+      <w:pPr>
+        <w:pStyle w:val="ListParagraph"/>
+        <w:numPr>
+          <w:ilvl w:val="0"/>
+          <w:numId w:val="6"/>
+        </w:numPr>
+      </w:pPr>
+      <w:r>
+        <w:t>Iksal and other stations labelled as (agricultural) are not available through the IMS API endpoints.</w:t>
+      </w:r>
+    </w:p>
+    <w:p>
+      <w:r>
+        <w:t>My proposed solution for this problem is to use other neighboring stations like Afula, Tavor, Afeq, Haifa Refineries, Haifa University, Haifa Technion, Haifa Port. All these stations provide current and historical data up to the year ~1994 which is more than enough, my plan is to use the past 5 years of data, use the first 3-4 years from 2020-2023 as training data and then for the latest year in the data 2024-2025 utilize the Nazareth station as a holdout validation station in order to evaluate the interpolation performance of my model. This solution addresses the lack of historical data provided by the Nazareth station and the evaluation method for the interpolated high-resolution forecast by providing a source of truth station inside the interpolated grid.</w:t>
       </w:r>
     </w:p>
     <w:p/>
@@ -484,6 +485,56 @@
 </w:document>
 </file>
 
+<file path=word/endnotes.xml><?xml version="1.0" encoding="utf-8"?>
+<w:endnotes xmlns:wpc="http://schemas.microsoft.com/office/word/2010/wordprocessingCanvas" xmlns:cx="http://schemas.microsoft.com/office/drawing/2014/chartex" xmlns:cx1="http://schemas.microsoft.com/office/drawing/2015/9/8/chartex" xmlns:cx2="http://schemas.microsoft.com/office/drawing/2015/10/21/chartex" xmlns:cx3="http://schemas.microsoft.com/office/drawing/2016/5/9/chartex" xmlns:cx4="http://schemas.microsoft.com/office/drawing/2016/5/10/chartex" xmlns:cx5="http://schemas.microsoft.com/office/drawing/2016/5/11/chartex" xmlns:cx6="http://schemas.microsoft.com/office/drawing/2016/5/12/chartex" xmlns:cx7="http://schemas.microsoft.com/office/drawing/2016/5/13/chartex" xmlns:cx8="http://schemas.microsoft.com/office/drawing/2016/5/14/chartex" xmlns:mc="http://schemas.openxmlformats.org/markup-compatibility/2006" xmlns:aink="http://schemas.microsoft.com/office/drawing/2016/ink" xmlns:am3d="http://schemas.microsoft.com/office/drawing/2017/model3d" xmlns:o="urn:schemas-microsoft-com:office:office" xmlns:oel="http://schemas.microsoft.com/office/2019/extlst" xmlns:r="http://schemas.openxmlformats.org/officeDocument/2006/relationships" xmlns:m="http://schemas.openxmlformats.org/officeDocument/2006/math" xmlns:v="urn:schemas-microsoft-com:vml" xmlns:wp14="http://schemas.microsoft.com/office/word/2010/wordprocessingDrawing" xmlns:wp="http://schemas.openxmlformats.org/drawingml/2006/wordprocessingDrawing" xmlns:w10="urn:schemas-microsoft-com:office:word" xmlns:w="http://schemas.openxmlformats.org/wordprocessingml/2006/main" xmlns:w14="http://schemas.microsoft.com/office/word/2010/wordml" xmlns:w15="http://schemas.microsoft.com/office/word/2012/wordml" xmlns:w16cex="http://schemas.microsoft.com/office/word/2018/wordml/cex" xmlns:w16cid="http://schemas.microsoft.com/office/word/2016/wordml/cid" xmlns:w16="http://schemas.microsoft.com/office/word/2018/wordml" xmlns:w16du="http://schemas.microsoft.com/office/word/2023/wordml/word16du" xmlns:w16sdtdh="http://schemas.microsoft.com/office/word/2020/wordml/sdtdatahash" xmlns:w16sdtfl="http://schemas.microsoft.com/office/word/2024/wordml/sdtformatlock" xmlns:w16se="http://schemas.microsoft.com/office/word/2015/wordml/symex" xmlns:wpg="http://schemas.microsoft.com/office/word/2010/wordprocessingGroup" xmlns:wpi="http://schemas.microsoft.com/office/word/2010/wordprocessingInk" xmlns:wne="http://schemas.microsoft.com/office/word/2006/wordml" xmlns:wps="http://schemas.microsoft.com/office/word/2010/wordprocessingShape" mc:Ignorable="w14 w15 w16se w16cid w16 w16cex w16sdtdh w16sdtfl w16du wp14">
+  <w:endnote w:type="separator" w:id="-1">
+    <w:p>
+      <w:pPr>
+        <w:spacing w:after="0" w:line="240" w:lineRule="auto"/>
+      </w:pPr>
+      <w:r>
+        <w:separator/>
+      </w:r>
+    </w:p>
+  </w:endnote>
+  <w:endnote w:type="continuationSeparator" w:id="0">
+    <w:p>
+      <w:pPr>
+        <w:spacing w:after="0" w:line="240" w:lineRule="auto"/>
+      </w:pPr>
+      <w:r>
+        <w:continuationSeparator/>
+      </w:r>
+    </w:p>
+  </w:endnote>
+</w:endnotes>
+</file>
+
+<file path=word/footnotes.xml><?xml version="1.0" encoding="utf-8"?>
+<w:footnotes xmlns:wpc="http://schemas.microsoft.com/office/word/2010/wordprocessingCanvas" xmlns:cx="http://schemas.microsoft.com/office/drawing/2014/chartex" xmlns:cx1="http://schemas.microsoft.com/office/drawing/2015/9/8/chartex" xmlns:cx2="http://schemas.microsoft.com/office/drawing/2015/10/21/chartex" xmlns:cx3="http://schemas.microsoft.com/office/drawing/2016/5/9/chartex" xmlns:cx4="http://schemas.microsoft.com/office/drawing/2016/5/10/chartex" xmlns:cx5="http://schemas.microsoft.com/office/drawing/2016/5/11/chartex" xmlns:cx6="http://schemas.microsoft.com/office/drawing/2016/5/12/chartex" xmlns:cx7="http://schemas.microsoft.com/office/drawing/2016/5/13/chartex" xmlns:cx8="http://schemas.microsoft.com/office/drawing/2016/5/14/chartex" xmlns:mc="http://schemas.openxmlformats.org/markup-compatibility/2006" xmlns:aink="http://schemas.microsoft.com/office/drawing/2016/ink" xmlns:am3d="http://schemas.microsoft.com/office/drawing/2017/model3d" xmlns:o="urn:schemas-microsoft-com:office:office" xmlns:oel="http://schemas.microsoft.com/office/2019/extlst" xmlns:r="http://schemas.openxmlformats.org/officeDocument/2006/relationships" xmlns:m="http://schemas.openxmlformats.org/officeDocument/2006/math" xmlns:v="urn:schemas-microsoft-com:vml" xmlns:wp14="http://schemas.microsoft.com/office/word/2010/wordprocessingDrawing" xmlns:wp="http://schemas.openxmlformats.org/drawingml/2006/wordprocessingDrawing" xmlns:w10="urn:schemas-microsoft-com:office:word" xmlns:w="http://schemas.openxmlformats.org/wordprocessingml/2006/main" xmlns:w14="http://schemas.microsoft.com/office/word/2010/wordml" xmlns:w15="http://schemas.microsoft.com/office/word/2012/wordml" xmlns:w16cex="http://schemas.microsoft.com/office/word/2018/wordml/cex" xmlns:w16cid="http://schemas.microsoft.com/office/word/2016/wordml/cid" xmlns:w16="http://schemas.microsoft.com/office/word/2018/wordml" xmlns:w16du="http://schemas.microsoft.com/office/word/2023/wordml/word16du" xmlns:w16sdtdh="http://schemas.microsoft.com/office/word/2020/wordml/sdtdatahash" xmlns:w16sdtfl="http://schemas.microsoft.com/office/word/2024/wordml/sdtformatlock" xmlns:w16se="http://schemas.microsoft.com/office/word/2015/wordml/symex" xmlns:wpg="http://schemas.microsoft.com/office/word/2010/wordprocessingGroup" xmlns:wpi="http://schemas.microsoft.com/office/word/2010/wordprocessingInk" xmlns:wne="http://schemas.microsoft.com/office/word/2006/wordml" xmlns:wps="http://schemas.microsoft.com/office/word/2010/wordprocessingShape" mc:Ignorable="w14 w15 w16se w16cid w16 w16cex w16sdtdh w16sdtfl w16du wp14">
+  <w:footnote w:type="separator" w:id="-1">
+    <w:p>
+      <w:pPr>
+        <w:spacing w:after="0" w:line="240" w:lineRule="auto"/>
+      </w:pPr>
+      <w:r>
+        <w:separator/>
+      </w:r>
+    </w:p>
+  </w:footnote>
+  <w:footnote w:type="continuationSeparator" w:id="0">
+    <w:p>
+      <w:pPr>
+        <w:spacing w:after="0" w:line="240" w:lineRule="auto"/>
+      </w:pPr>
+      <w:r>
+        <w:continuationSeparator/>
+      </w:r>
+    </w:p>
+  </w:footnote>
+</w:footnotes>
+</file>
+
 <file path=word/numbering.xml><?xml version="1.0" encoding="utf-8"?>
 <w:numbering xmlns:wpc="http://schemas.microsoft.com/office/word/2010/wordprocessingCanvas" xmlns:cx="http://schemas.microsoft.com/office/drawing/2014/chartex" xmlns:cx1="http://schemas.microsoft.com/office/drawing/2015/9/8/chartex" xmlns:cx2="http://schemas.microsoft.com/office/drawing/2015/10/21/chartex" xmlns:cx3="http://schemas.microsoft.com/office/drawing/2016/5/9/chartex" xmlns:cx4="http://schemas.microsoft.com/office/drawing/2016/5/10/chartex" xmlns:cx5="http://schemas.microsoft.com/office/drawing/2016/5/11/chartex" xmlns:cx6="http://schemas.microsoft.com/office/drawing/2016/5/12/chartex" xmlns:cx7="http://schemas.microsoft.com/office/drawing/2016/5/13/chartex" xmlns:cx8="http://schemas.microsoft.com/office/drawing/2016/5/14/chartex" xmlns:mc="http://schemas.openxmlformats.org/markup-compatibility/2006" xmlns:aink="http://schemas.microsoft.com/office/drawing/2016/ink" xmlns:am3d="http://schemas.microsoft.com/office/drawing/2017/model3d" xmlns:o="urn:schemas-microsoft-com:office:office" xmlns:oel="http://schemas.microsoft.com/office/2019/extlst" xmlns:r="http://schemas.openxmlformats.org/officeDocument/2006/relationships" xmlns:m="http://schemas.openxmlformats.org/officeDocument/2006/math" xmlns:v="urn:schemas-microsoft-com:vml" xmlns:wp14="http://schemas.microsoft.com/office/word/2010/wordprocessingDrawing" xmlns:wp="http://schemas.openxmlformats.org/drawingml/2006/wordprocessingDrawing" xmlns:w10="urn:schemas-microsoft-com:office:word" xmlns:w="http://schemas.openxmlformats.org/wordprocessingml/2006/main" xmlns:w14="http://schemas.microsoft.com/office/word/2010/wordml" xmlns:w15="http://schemas.microsoft.com/office/word/2012/wordml" xmlns:w16cex="http://schemas.microsoft.com/office/word/2018/wordml/cex" xmlns:w16cid="http://schemas.microsoft.com/office/word/2016/wordml/cid" xmlns:w16="http://schemas.microsoft.com/office/word/2018/wordml" xmlns:w16du="http://schemas.microsoft.com/office/word/2023/wordml/word16du" xmlns:w16sdtdh="http://schemas.microsoft.com/office/word/2020/wordml/sdtdatahash" xmlns:w16sdtfl="http://schemas.microsoft.com/office/word/2024/wordml/sdtformatlock" xmlns:w16se="http://schemas.microsoft.com/office/word/2015/wordml/symex" xmlns:wpg="http://schemas.microsoft.com/office/word/2010/wordprocessingGroup" xmlns:wpi="http://schemas.microsoft.com/office/word/2010/wordprocessingInk" xmlns:wne="http://schemas.microsoft.com/office/word/2006/wordml" xmlns:wps="http://schemas.microsoft.com/office/word/2010/wordprocessingShape" mc:Ignorable="w14 w15 w16se w16cid w16 w16cex w16sdtdh w16sdtfl w16du wp14">
   <w:abstractNum w:abstractNumId="0" w15:restartNumberingAfterBreak="0">
@@ -775,6 +826,95 @@
     </w:lvl>
   </w:abstractNum>
   <w:abstractNum w:abstractNumId="3" w15:restartNumberingAfterBreak="0">
+    <w:nsid w:val="1BB4787D"/>
+    <w:multiLevelType w:val="hybridMultilevel"/>
+    <w:tmpl w:val="D0A8689C"/>
+    <w:lvl w:ilvl="0" w:tplc="A21EF334">
+      <w:start w:val="1"/>
+      <w:numFmt w:val="decimal"/>
+      <w:lvlText w:val="%1)"/>
+      <w:lvlJc w:val="left"/>
+      <w:pPr>
+        <w:ind w:left="720" w:hanging="360"/>
+      </w:pPr>
+      <w:rPr>
+        <w:rFonts w:asciiTheme="minorHAnsi" w:eastAsiaTheme="minorHAnsi" w:hAnsiTheme="minorHAnsi" w:cstheme="minorBidi"/>
+      </w:rPr>
+    </w:lvl>
+    <w:lvl w:ilvl="1" w:tplc="04090019" w:tentative="1">
+      <w:start w:val="1"/>
+      <w:numFmt w:val="lowerLetter"/>
+      <w:lvlText w:val="%2."/>
+      <w:lvlJc w:val="left"/>
+      <w:pPr>
+        <w:ind w:left="1440" w:hanging="360"/>
+      </w:pPr>
+    </w:lvl>
+    <w:lvl w:ilvl="2" w:tplc="0409001B" w:tentative="1">
+      <w:start w:val="1"/>
+      <w:numFmt w:val="lowerRoman"/>
+      <w:lvlText w:val="%3."/>
+      <w:lvlJc w:val="right"/>
+      <w:pPr>
+        <w:ind w:left="2160" w:hanging="180"/>
+      </w:pPr>
+    </w:lvl>
+    <w:lvl w:ilvl="3" w:tplc="0409000F" w:tentative="1">
+      <w:start w:val="1"/>
+      <w:numFmt w:val="decimal"/>
+      <w:lvlText w:val="%4."/>
+      <w:lvlJc w:val="left"/>
+      <w:pPr>
+        <w:ind w:left="2880" w:hanging="360"/>
+      </w:pPr>
+    </w:lvl>
+    <w:lvl w:ilvl="4" w:tplc="04090019" w:tentative="1">
+      <w:start w:val="1"/>
+      <w:numFmt w:val="lowerLetter"/>
+      <w:lvlText w:val="%5."/>
+      <w:lvlJc w:val="left"/>
+      <w:pPr>
+        <w:ind w:left="3600" w:hanging="360"/>
+      </w:pPr>
+    </w:lvl>
+    <w:lvl w:ilvl="5" w:tplc="0409001B" w:tentative="1">
+      <w:start w:val="1"/>
+      <w:numFmt w:val="lowerRoman"/>
+      <w:lvlText w:val="%6."/>
+      <w:lvlJc w:val="right"/>
+      <w:pPr>
+        <w:ind w:left="4320" w:hanging="180"/>
+      </w:pPr>
+    </w:lvl>
+    <w:lvl w:ilvl="6" w:tplc="0409000F" w:tentative="1">
+      <w:start w:val="1"/>
+      <w:numFmt w:val="decimal"/>
+      <w:lvlText w:val="%7."/>
+      <w:lvlJc w:val="left"/>
+      <w:pPr>
+        <w:ind w:left="5040" w:hanging="360"/>
+      </w:pPr>
+    </w:lvl>
+    <w:lvl w:ilvl="7" w:tplc="04090019" w:tentative="1">
+      <w:start w:val="1"/>
+      <w:numFmt w:val="lowerLetter"/>
+      <w:lvlText w:val="%8."/>
+      <w:lvlJc w:val="left"/>
+      <w:pPr>
+        <w:ind w:left="5760" w:hanging="360"/>
+      </w:pPr>
+    </w:lvl>
+    <w:lvl w:ilvl="8" w:tplc="0409001B" w:tentative="1">
+      <w:start w:val="1"/>
+      <w:numFmt w:val="lowerRoman"/>
+      <w:lvlText w:val="%9."/>
+      <w:lvlJc w:val="right"/>
+      <w:pPr>
+        <w:ind w:left="6480" w:hanging="180"/>
+      </w:pPr>
+    </w:lvl>
+  </w:abstractNum>
+  <w:abstractNum w:abstractNumId="4" w15:restartNumberingAfterBreak="0">
     <w:nsid w:val="41CE4552"/>
     <w:multiLevelType w:val="hybridMultilevel"/>
     <w:tmpl w:val="15E69BE2"/>
@@ -860,7 +1000,209 @@
       </w:pPr>
     </w:lvl>
   </w:abstractNum>
-  <w:abstractNum w:abstractNumId="4" w15:restartNumberingAfterBreak="0">
+  <w:abstractNum w:abstractNumId="5" w15:restartNumberingAfterBreak="0">
+    <w:nsid w:val="439D1AF5"/>
+    <w:multiLevelType w:val="hybridMultilevel"/>
+    <w:tmpl w:val="36246856"/>
+    <w:lvl w:ilvl="0" w:tplc="39AE53FA">
+      <w:start w:val="10"/>
+      <w:numFmt w:val="decimal"/>
+      <w:lvlText w:val="%1"/>
+      <w:lvlJc w:val="left"/>
+      <w:pPr>
+        <w:ind w:left="720" w:hanging="360"/>
+      </w:pPr>
+      <w:rPr>
+        <w:rFonts w:hint="default"/>
+      </w:rPr>
+    </w:lvl>
+    <w:lvl w:ilvl="1" w:tplc="04090019" w:tentative="1">
+      <w:start w:val="1"/>
+      <w:numFmt w:val="lowerLetter"/>
+      <w:lvlText w:val="%2."/>
+      <w:lvlJc w:val="left"/>
+      <w:pPr>
+        <w:ind w:left="1440" w:hanging="360"/>
+      </w:pPr>
+    </w:lvl>
+    <w:lvl w:ilvl="2" w:tplc="0409001B" w:tentative="1">
+      <w:start w:val="1"/>
+      <w:numFmt w:val="lowerRoman"/>
+      <w:lvlText w:val="%3."/>
+      <w:lvlJc w:val="right"/>
+      <w:pPr>
+        <w:ind w:left="2160" w:hanging="180"/>
+      </w:pPr>
+    </w:lvl>
+    <w:lvl w:ilvl="3" w:tplc="0409000F" w:tentative="1">
+      <w:start w:val="1"/>
+      <w:numFmt w:val="decimal"/>
+      <w:lvlText w:val="%4."/>
+      <w:lvlJc w:val="left"/>
+      <w:pPr>
+        <w:ind w:left="2880" w:hanging="360"/>
+      </w:pPr>
+    </w:lvl>
+    <w:lvl w:ilvl="4" w:tplc="04090019" w:tentative="1">
+      <w:start w:val="1"/>
+      <w:numFmt w:val="lowerLetter"/>
+      <w:lvlText w:val="%5."/>
+      <w:lvlJc w:val="left"/>
+      <w:pPr>
+        <w:ind w:left="3600" w:hanging="360"/>
+      </w:pPr>
+    </w:lvl>
+    <w:lvl w:ilvl="5" w:tplc="0409001B" w:tentative="1">
+      <w:start w:val="1"/>
+      <w:numFmt w:val="lowerRoman"/>
+      <w:lvlText w:val="%6."/>
+      <w:lvlJc w:val="right"/>
+      <w:pPr>
+        <w:ind w:left="4320" w:hanging="180"/>
+      </w:pPr>
+    </w:lvl>
+    <w:lvl w:ilvl="6" w:tplc="0409000F" w:tentative="1">
+      <w:start w:val="1"/>
+      <w:numFmt w:val="decimal"/>
+      <w:lvlText w:val="%7."/>
+      <w:lvlJc w:val="left"/>
+      <w:pPr>
+        <w:ind w:left="5040" w:hanging="360"/>
+      </w:pPr>
+    </w:lvl>
+    <w:lvl w:ilvl="7" w:tplc="04090019" w:tentative="1">
+      <w:start w:val="1"/>
+      <w:numFmt w:val="lowerLetter"/>
+      <w:lvlText w:val="%8."/>
+      <w:lvlJc w:val="left"/>
+      <w:pPr>
+        <w:ind w:left="5760" w:hanging="360"/>
+      </w:pPr>
+    </w:lvl>
+    <w:lvl w:ilvl="8" w:tplc="0409001B" w:tentative="1">
+      <w:start w:val="1"/>
+      <w:numFmt w:val="lowerRoman"/>
+      <w:lvlText w:val="%9."/>
+      <w:lvlJc w:val="right"/>
+      <w:pPr>
+        <w:ind w:left="6480" w:hanging="180"/>
+      </w:pPr>
+    </w:lvl>
+  </w:abstractNum>
+  <w:abstractNum w:abstractNumId="6" w15:restartNumberingAfterBreak="0">
+    <w:nsid w:val="586018A5"/>
+    <w:multiLevelType w:val="hybridMultilevel"/>
+    <w:tmpl w:val="9A82D746"/>
+    <w:lvl w:ilvl="0" w:tplc="F2789EA4">
+      <w:start w:val="1"/>
+      <w:numFmt w:val="bullet"/>
+      <w:lvlText w:val="-"/>
+      <w:lvlJc w:val="left"/>
+      <w:pPr>
+        <w:ind w:left="720" w:hanging="360"/>
+      </w:pPr>
+      <w:rPr>
+        <w:rFonts w:ascii="Aptos" w:eastAsiaTheme="minorHAnsi" w:hAnsi="Aptos" w:cstheme="minorBidi" w:hint="default"/>
+      </w:rPr>
+    </w:lvl>
+    <w:lvl w:ilvl="1" w:tplc="04090003" w:tentative="1">
+      <w:start w:val="1"/>
+      <w:numFmt w:val="bullet"/>
+      <w:lvlText w:val="o"/>
+      <w:lvlJc w:val="left"/>
+      <w:pPr>
+        <w:ind w:left="1440" w:hanging="360"/>
+      </w:pPr>
+      <w:rPr>
+        <w:rFonts w:ascii="Courier New" w:hAnsi="Courier New" w:cs="Courier New" w:hint="default"/>
+      </w:rPr>
+    </w:lvl>
+    <w:lvl w:ilvl="2" w:tplc="04090005" w:tentative="1">
+      <w:start w:val="1"/>
+      <w:numFmt w:val="bullet"/>
+      <w:lvlText w:val=""/>
+      <w:lvlJc w:val="left"/>
+      <w:pPr>
+        <w:ind w:left="2160" w:hanging="360"/>
+      </w:pPr>
+      <w:rPr>
+        <w:rFonts w:ascii="Wingdings" w:hAnsi="Wingdings" w:hint="default"/>
+      </w:rPr>
+    </w:lvl>
+    <w:lvl w:ilvl="3" w:tplc="04090001" w:tentative="1">
+      <w:start w:val="1"/>
+      <w:numFmt w:val="bullet"/>
+      <w:lvlText w:val=""/>
+      <w:lvlJc w:val="left"/>
+      <w:pPr>
+        <w:ind w:left="2880" w:hanging="360"/>
+      </w:pPr>
+      <w:rPr>
+        <w:rFonts w:ascii="Symbol" w:hAnsi="Symbol" w:hint="default"/>
+      </w:rPr>
+    </w:lvl>
+    <w:lvl w:ilvl="4" w:tplc="04090003" w:tentative="1">
+      <w:start w:val="1"/>
+      <w:numFmt w:val="bullet"/>
+      <w:lvlText w:val="o"/>
+      <w:lvlJc w:val="left"/>
+      <w:pPr>
+        <w:ind w:left="3600" w:hanging="360"/>
+      </w:pPr>
+      <w:rPr>
+        <w:rFonts w:ascii="Courier New" w:hAnsi="Courier New" w:cs="Courier New" w:hint="default"/>
+      </w:rPr>
+    </w:lvl>
+    <w:lvl w:ilvl="5" w:tplc="04090005" w:tentative="1">
+      <w:start w:val="1"/>
+      <w:numFmt w:val="bullet"/>
+      <w:lvlText w:val=""/>
+      <w:lvlJc w:val="left"/>
+      <w:pPr>
+        <w:ind w:left="4320" w:hanging="360"/>
+      </w:pPr>
+      <w:rPr>
+        <w:rFonts w:ascii="Wingdings" w:hAnsi="Wingdings" w:hint="default"/>
+      </w:rPr>
+    </w:lvl>
+    <w:lvl w:ilvl="6" w:tplc="04090001" w:tentative="1">
+      <w:start w:val="1"/>
+      <w:numFmt w:val="bullet"/>
+      <w:lvlText w:val=""/>
+      <w:lvlJc w:val="left"/>
+      <w:pPr>
+        <w:ind w:left="5040" w:hanging="360"/>
+      </w:pPr>
+      <w:rPr>
+        <w:rFonts w:ascii="Symbol" w:hAnsi="Symbol" w:hint="default"/>
+      </w:rPr>
+    </w:lvl>
+    <w:lvl w:ilvl="7" w:tplc="04090003" w:tentative="1">
+      <w:start w:val="1"/>
+      <w:numFmt w:val="bullet"/>
+      <w:lvlText w:val="o"/>
+      <w:lvlJc w:val="left"/>
+      <w:pPr>
+        <w:ind w:left="5760" w:hanging="360"/>
+      </w:pPr>
+      <w:rPr>
+        <w:rFonts w:ascii="Courier New" w:hAnsi="Courier New" w:cs="Courier New" w:hint="default"/>
+      </w:rPr>
+    </w:lvl>
+    <w:lvl w:ilvl="8" w:tplc="04090005" w:tentative="1">
+      <w:start w:val="1"/>
+      <w:numFmt w:val="bullet"/>
+      <w:lvlText w:val=""/>
+      <w:lvlJc w:val="left"/>
+      <w:pPr>
+        <w:ind w:left="6480" w:hanging="360"/>
+      </w:pPr>
+      <w:rPr>
+        <w:rFonts w:ascii="Wingdings" w:hAnsi="Wingdings" w:hint="default"/>
+      </w:rPr>
+    </w:lvl>
+  </w:abstractNum>
+  <w:abstractNum w:abstractNumId="7" w15:restartNumberingAfterBreak="0">
     <w:nsid w:val="5F7B3161"/>
     <w:multiLevelType w:val="hybridMultilevel"/>
     <w:tmpl w:val="2E38A716"/>
@@ -950,10 +1292,10 @@
     </w:lvl>
   </w:abstractNum>
   <w:num w:numId="1" w16cid:durableId="956251838">
-    <w:abstractNumId w:val="3"/>
+    <w:abstractNumId w:val="4"/>
   </w:num>
   <w:num w:numId="2" w16cid:durableId="1537934179">
-    <w:abstractNumId w:val="4"/>
+    <w:abstractNumId w:val="7"/>
   </w:num>
   <w:num w:numId="3" w16cid:durableId="88817768">
     <w:abstractNumId w:val="1"/>
@@ -963,6 +1305,15 @@
   </w:num>
   <w:num w:numId="5" w16cid:durableId="669869956">
     <w:abstractNumId w:val="0"/>
+  </w:num>
+  <w:num w:numId="6" w16cid:durableId="515656069">
+    <w:abstractNumId w:val="3"/>
+  </w:num>
+  <w:num w:numId="7" w16cid:durableId="158346723">
+    <w:abstractNumId w:val="5"/>
+  </w:num>
+  <w:num w:numId="8" w16cid:durableId="38747683">
+    <w:abstractNumId w:val="6"/>
   </w:num>
 </w:numbering>
 </file>
@@ -1883,6 +2234,50 @@
       <w:spacing w:val="5"/>
     </w:rPr>
   </w:style>
+  <w:style w:type="paragraph" w:styleId="Header">
+    <w:name w:val="header"/>
+    <w:basedOn w:val="Normal"/>
+    <w:link w:val="HeaderChar"/>
+    <w:uiPriority w:val="99"/>
+    <w:unhideWhenUsed/>
+    <w:rsid w:val="00FE4470"/>
+    <w:pPr>
+      <w:tabs>
+        <w:tab w:val="center" w:pos="4680"/>
+        <w:tab w:val="right" w:pos="9360"/>
+      </w:tabs>
+      <w:spacing w:after="0" w:line="240" w:lineRule="auto"/>
+    </w:pPr>
+  </w:style>
+  <w:style w:type="character" w:customStyle="1" w:styleId="HeaderChar">
+    <w:name w:val="Header Char"/>
+    <w:basedOn w:val="DefaultParagraphFont"/>
+    <w:link w:val="Header"/>
+    <w:uiPriority w:val="99"/>
+    <w:rsid w:val="00FE4470"/>
+  </w:style>
+  <w:style w:type="paragraph" w:styleId="Footer">
+    <w:name w:val="footer"/>
+    <w:basedOn w:val="Normal"/>
+    <w:link w:val="FooterChar"/>
+    <w:uiPriority w:val="99"/>
+    <w:unhideWhenUsed/>
+    <w:rsid w:val="00FE4470"/>
+    <w:pPr>
+      <w:tabs>
+        <w:tab w:val="center" w:pos="4680"/>
+        <w:tab w:val="right" w:pos="9360"/>
+      </w:tabs>
+      <w:spacing w:after="0" w:line="240" w:lineRule="auto"/>
+    </w:pPr>
+  </w:style>
+  <w:style w:type="character" w:customStyle="1" w:styleId="FooterChar">
+    <w:name w:val="Footer Char"/>
+    <w:basedOn w:val="DefaultParagraphFont"/>
+    <w:link w:val="Footer"/>
+    <w:uiPriority w:val="99"/>
+    <w:rsid w:val="00FE4470"/>
+  </w:style>
 </w:styles>
 </file>
 

</xml_diff>

<commit_message>
Adds data health check to research word doc and proposed solution for missing barometric pressure
</commit_message>
<xml_diff>
--- a/Research.docx
+++ b/Research.docx
@@ -431,6 +431,21 @@
       </w:r>
     </w:p>
     <w:p>
+      <w:pPr>
+        <w:rPr>
+          <w:b/>
+          <w:bCs/>
+        </w:rPr>
+      </w:pPr>
+      <w:r>
+        <w:rPr>
+          <w:b/>
+          <w:bCs/>
+        </w:rPr>
+        <w:t>Insufficient Historical Station Data:</w:t>
+      </w:r>
+    </w:p>
+    <w:p>
       <w:r>
         <w:t>For the project I wanted to interpolate the weather data between the Nazareth, Afula and Iksal stations, after doing research on the available data of these stations it turns out that:</w:t>
       </w:r>
@@ -473,8 +488,1424 @@
         <w:t>My proposed solution for this problem is to use other neighboring stations like Afula, Tavor, Afeq, Haifa Refineries, Haifa University, Haifa Technion, Haifa Port. All these stations provide current and historical data up to the year ~1994 which is more than enough, my plan is to use the past 5 years of data, use the first 3-4 years from 2020-2023 as training data and then for the latest year in the data 2024-2025 utilize the Nazareth station as a holdout validation station in order to evaluate the interpolation performance of my model. This solution addresses the lack of historical data provided by the Nazareth station and the evaluation method for the interpolated high-resolution forecast by providing a source of truth station inside the interpolated grid.</w:t>
       </w:r>
     </w:p>
+    <w:p>
+      <w:pPr>
+        <w:rPr>
+          <w:b/>
+          <w:bCs/>
+        </w:rPr>
+      </w:pPr>
+      <w:r>
+        <w:rPr>
+          <w:b/>
+          <w:bCs/>
+        </w:rPr>
+        <w:t>Missing Critical Feature</w:t>
+      </w:r>
+      <w:r>
+        <w:rPr>
+          <w:b/>
+          <w:bCs/>
+        </w:rPr>
+        <w:t xml:space="preserve"> (Barometric Pressure)</w:t>
+      </w:r>
+      <w:r>
+        <w:rPr>
+          <w:b/>
+          <w:bCs/>
+        </w:rPr>
+        <w:t>:</w:t>
+      </w:r>
+    </w:p>
+    <w:p>
+      <w:r>
+        <w:t>The IMS reports on their API page that they offer the Barometric Pressure (BP) measurements. However, upon further investigation I found that no station offers barometric pressure measurements. Barometric pressure is important because it’s a high indicator of precipitation, high pressure is associated with sinking, cold, dense air that typically leads to clear calm weather. Low pressure is associated with rising, warm, less dense air, which is often linked to cloudiness and precipitation.</w:t>
+      </w:r>
+    </w:p>
+    <w:p>
+      <w:r>
+        <w:t xml:space="preserve">My proposed solution is to </w:t>
+      </w:r>
+      <w:r>
+        <w:t>try to capture the barometric pressure by converting wind speed and wind direction to U and V vectors since wind results from a horizontal difference in air pressure</w:t>
+      </w:r>
+      <w:r>
+        <w:t>. Wind moves from high pressure regions to lower pressure regions.</w:t>
+      </w:r>
+    </w:p>
     <w:p/>
     <w:p/>
+    <w:p/>
+    <w:p/>
+    <w:p/>
+    <w:p>
+      <w:pPr>
+        <w:rPr>
+          <w:b/>
+          <w:bCs/>
+          <w:sz w:val="32"/>
+          <w:szCs w:val="32"/>
+        </w:rPr>
+      </w:pPr>
+      <w:r>
+        <w:rPr>
+          <w:b/>
+          <w:bCs/>
+          <w:sz w:val="32"/>
+          <w:szCs w:val="32"/>
+        </w:rPr>
+        <w:lastRenderedPageBreak/>
+        <w:t>Data Quality Assessment</w:t>
+      </w:r>
+    </w:p>
+    <w:p>
+      <w:pPr>
+        <w:rPr>
+          <w:b/>
+          <w:bCs/>
+        </w:rPr>
+      </w:pPr>
+      <w:r>
+        <w:rPr>
+          <w:b/>
+          <w:bCs/>
+        </w:rPr>
+        <w:t>Data Missingness Table</w:t>
+      </w:r>
+    </w:p>
+    <w:tbl>
+      <w:tblPr>
+        <w:tblStyle w:val="TableGrid"/>
+        <w:tblW w:w="10440" w:type="dxa"/>
+        <w:tblInd w:w="-455" w:type="dxa"/>
+        <w:tblLayout w:type="fixed"/>
+        <w:tblLook w:val="04A0" w:firstRow="1" w:lastRow="0" w:firstColumn="1" w:lastColumn="0" w:noHBand="0" w:noVBand="1"/>
+      </w:tblPr>
+      <w:tblGrid>
+        <w:gridCol w:w="1491"/>
+        <w:gridCol w:w="1491"/>
+        <w:gridCol w:w="1492"/>
+        <w:gridCol w:w="1491"/>
+        <w:gridCol w:w="1492"/>
+        <w:gridCol w:w="1491"/>
+        <w:gridCol w:w="1492"/>
+      </w:tblGrid>
+      <w:tr>
+        <w:trPr>
+          <w:trHeight w:val="879"/>
+        </w:trPr>
+        <w:tc>
+          <w:tcPr>
+            <w:tcW w:w="1491" w:type="dxa"/>
+          </w:tcPr>
+          <w:p>
+            <w:pPr>
+              <w:rPr>
+                <w:b/>
+                <w:bCs/>
+              </w:rPr>
+            </w:pPr>
+            <w:r>
+              <w:rPr>
+                <w:b/>
+                <w:bCs/>
+              </w:rPr>
+              <w:t>Station Name/ ID</w:t>
+            </w:r>
+          </w:p>
+        </w:tc>
+        <w:tc>
+          <w:tcPr>
+            <w:tcW w:w="1491" w:type="dxa"/>
+          </w:tcPr>
+          <w:p>
+            <w:pPr>
+              <w:rPr>
+                <w:b/>
+                <w:bCs/>
+              </w:rPr>
+            </w:pPr>
+            <w:r>
+              <w:rPr>
+                <w:b/>
+                <w:bCs/>
+              </w:rPr>
+              <w:t>Total Rows</w:t>
+            </w:r>
+          </w:p>
+        </w:tc>
+        <w:tc>
+          <w:tcPr>
+            <w:tcW w:w="1492" w:type="dxa"/>
+          </w:tcPr>
+          <w:p>
+            <w:pPr>
+              <w:rPr>
+                <w:b/>
+                <w:bCs/>
+              </w:rPr>
+            </w:pPr>
+            <w:r>
+              <w:rPr>
+                <w:b/>
+                <w:bCs/>
+              </w:rPr>
+              <w:t>Rain Available %</w:t>
+            </w:r>
+          </w:p>
+        </w:tc>
+        <w:tc>
+          <w:tcPr>
+            <w:tcW w:w="1491" w:type="dxa"/>
+          </w:tcPr>
+          <w:p>
+            <w:pPr>
+              <w:rPr>
+                <w:b/>
+                <w:bCs/>
+              </w:rPr>
+            </w:pPr>
+            <w:r>
+              <w:rPr>
+                <w:b/>
+                <w:bCs/>
+              </w:rPr>
+              <w:t>Temperature Available %</w:t>
+            </w:r>
+          </w:p>
+        </w:tc>
+        <w:tc>
+          <w:tcPr>
+            <w:tcW w:w="1492" w:type="dxa"/>
+          </w:tcPr>
+          <w:p>
+            <w:pPr>
+              <w:rPr>
+                <w:b/>
+                <w:bCs/>
+              </w:rPr>
+            </w:pPr>
+            <w:r>
+              <w:rPr>
+                <w:b/>
+                <w:bCs/>
+              </w:rPr>
+              <w:t>Humidity Available %</w:t>
+            </w:r>
+          </w:p>
+        </w:tc>
+        <w:tc>
+          <w:tcPr>
+            <w:tcW w:w="1491" w:type="dxa"/>
+          </w:tcPr>
+          <w:p>
+            <w:pPr>
+              <w:rPr>
+                <w:b/>
+                <w:bCs/>
+              </w:rPr>
+            </w:pPr>
+            <w:r>
+              <w:rPr>
+                <w:b/>
+                <w:bCs/>
+              </w:rPr>
+              <w:t>Wind Available %</w:t>
+            </w:r>
+          </w:p>
+        </w:tc>
+        <w:tc>
+          <w:tcPr>
+            <w:tcW w:w="1492" w:type="dxa"/>
+          </w:tcPr>
+          <w:p>
+            <w:pPr>
+              <w:rPr>
+                <w:b/>
+                <w:bCs/>
+              </w:rPr>
+            </w:pPr>
+            <w:r>
+              <w:rPr>
+                <w:b/>
+                <w:bCs/>
+              </w:rPr>
+              <w:t>Pressure Available %</w:t>
+            </w:r>
+          </w:p>
+        </w:tc>
+      </w:tr>
+      <w:tr>
+        <w:trPr>
+          <w:trHeight w:val="879"/>
+        </w:trPr>
+        <w:tc>
+          <w:tcPr>
+            <w:tcW w:w="1491" w:type="dxa"/>
+          </w:tcPr>
+          <w:p>
+            <w:pPr>
+              <w:rPr>
+                <w:b/>
+                <w:bCs/>
+              </w:rPr>
+            </w:pPr>
+            <w:r>
+              <w:rPr>
+                <w:b/>
+                <w:bCs/>
+              </w:rPr>
+              <w:t>Tavor Kadoori/13</w:t>
+            </w:r>
+          </w:p>
+        </w:tc>
+        <w:tc>
+          <w:tcPr>
+            <w:tcW w:w="1491" w:type="dxa"/>
+          </w:tcPr>
+          <w:p>
+            <w:r>
+              <w:t>261473</w:t>
+            </w:r>
+          </w:p>
+        </w:tc>
+        <w:tc>
+          <w:tcPr>
+            <w:tcW w:w="1492" w:type="dxa"/>
+          </w:tcPr>
+          <w:p>
+            <w:r>
+              <w:t>100.0</w:t>
+            </w:r>
+          </w:p>
+        </w:tc>
+        <w:tc>
+          <w:tcPr>
+            <w:tcW w:w="1491" w:type="dxa"/>
+          </w:tcPr>
+          <w:p>
+            <w:r>
+              <w:t>99.9</w:t>
+            </w:r>
+          </w:p>
+        </w:tc>
+        <w:tc>
+          <w:tcPr>
+            <w:tcW w:w="1492" w:type="dxa"/>
+          </w:tcPr>
+          <w:p>
+            <w:r>
+              <w:t>99.9</w:t>
+            </w:r>
+          </w:p>
+        </w:tc>
+        <w:tc>
+          <w:tcPr>
+            <w:tcW w:w="1491" w:type="dxa"/>
+          </w:tcPr>
+          <w:p>
+            <w:r>
+              <w:t>99.9</w:t>
+            </w:r>
+          </w:p>
+        </w:tc>
+        <w:tc>
+          <w:tcPr>
+            <w:tcW w:w="1492" w:type="dxa"/>
+          </w:tcPr>
+          <w:p>
+            <w:r>
+              <w:t>0.0</w:t>
+            </w:r>
+          </w:p>
+        </w:tc>
+      </w:tr>
+      <w:tr>
+        <w:trPr>
+          <w:trHeight w:val="879"/>
+        </w:trPr>
+        <w:tc>
+          <w:tcPr>
+            <w:tcW w:w="1491" w:type="dxa"/>
+          </w:tcPr>
+          <w:p>
+            <w:pPr>
+              <w:rPr>
+                <w:b/>
+                <w:bCs/>
+              </w:rPr>
+            </w:pPr>
+            <w:r>
+              <w:rPr>
+                <w:b/>
+                <w:bCs/>
+              </w:rPr>
+              <w:t>Afula Ner Haemek/16</w:t>
+            </w:r>
+          </w:p>
+        </w:tc>
+        <w:tc>
+          <w:tcPr>
+            <w:tcW w:w="1491" w:type="dxa"/>
+          </w:tcPr>
+          <w:p>
+            <w:r>
+              <w:t>262903</w:t>
+            </w:r>
+          </w:p>
+        </w:tc>
+        <w:tc>
+          <w:tcPr>
+            <w:tcW w:w="1492" w:type="dxa"/>
+          </w:tcPr>
+          <w:p>
+            <w:r>
+              <w:t>99.0</w:t>
+            </w:r>
+          </w:p>
+        </w:tc>
+        <w:tc>
+          <w:tcPr>
+            <w:tcW w:w="1491" w:type="dxa"/>
+          </w:tcPr>
+          <w:p>
+            <w:r>
+              <w:t>100.0</w:t>
+            </w:r>
+          </w:p>
+        </w:tc>
+        <w:tc>
+          <w:tcPr>
+            <w:tcW w:w="1492" w:type="dxa"/>
+          </w:tcPr>
+          <w:p>
+            <w:r>
+              <w:t>100.0</w:t>
+            </w:r>
+          </w:p>
+        </w:tc>
+        <w:tc>
+          <w:tcPr>
+            <w:tcW w:w="1491" w:type="dxa"/>
+          </w:tcPr>
+          <w:p>
+            <w:r>
+              <w:t>100.0</w:t>
+            </w:r>
+          </w:p>
+        </w:tc>
+        <w:tc>
+          <w:tcPr>
+            <w:tcW w:w="1492" w:type="dxa"/>
+          </w:tcPr>
+          <w:p>
+            <w:r>
+              <w:t>0.0</w:t>
+            </w:r>
+          </w:p>
+        </w:tc>
+      </w:tr>
+      <w:tr>
+        <w:trPr>
+          <w:trHeight w:val="879"/>
+        </w:trPr>
+        <w:tc>
+          <w:tcPr>
+            <w:tcW w:w="1491" w:type="dxa"/>
+          </w:tcPr>
+          <w:p>
+            <w:pPr>
+              <w:rPr>
+                <w:b/>
+                <w:bCs/>
+              </w:rPr>
+            </w:pPr>
+            <w:r>
+              <w:rPr>
+                <w:b/>
+                <w:bCs/>
+              </w:rPr>
+              <w:t>Newe Yaa’r/186</w:t>
+            </w:r>
+          </w:p>
+        </w:tc>
+        <w:tc>
+          <w:tcPr>
+            <w:tcW w:w="1491" w:type="dxa"/>
+          </w:tcPr>
+          <w:p>
+            <w:r>
+              <w:t>262795</w:t>
+            </w:r>
+          </w:p>
+        </w:tc>
+        <w:tc>
+          <w:tcPr>
+            <w:tcW w:w="1492" w:type="dxa"/>
+          </w:tcPr>
+          <w:p>
+            <w:r>
+              <w:t>100.0</w:t>
+            </w:r>
+          </w:p>
+        </w:tc>
+        <w:tc>
+          <w:tcPr>
+            <w:tcW w:w="1491" w:type="dxa"/>
+          </w:tcPr>
+          <w:p>
+            <w:r>
+              <w:t>99.9</w:t>
+            </w:r>
+          </w:p>
+        </w:tc>
+        <w:tc>
+          <w:tcPr>
+            <w:tcW w:w="1492" w:type="dxa"/>
+          </w:tcPr>
+          <w:p>
+            <w:r>
+              <w:t>99.9</w:t>
+            </w:r>
+          </w:p>
+        </w:tc>
+        <w:tc>
+          <w:tcPr>
+            <w:tcW w:w="1491" w:type="dxa"/>
+          </w:tcPr>
+          <w:p>
+            <w:r>
+              <w:t>100.0</w:t>
+            </w:r>
+          </w:p>
+        </w:tc>
+        <w:tc>
+          <w:tcPr>
+            <w:tcW w:w="1492" w:type="dxa"/>
+          </w:tcPr>
+          <w:p>
+            <w:r>
+              <w:t>0.0</w:t>
+            </w:r>
+          </w:p>
+        </w:tc>
+      </w:tr>
+      <w:tr>
+        <w:trPr>
+          <w:trHeight w:val="879"/>
+        </w:trPr>
+        <w:tc>
+          <w:tcPr>
+            <w:tcW w:w="1491" w:type="dxa"/>
+          </w:tcPr>
+          <w:p>
+            <w:pPr>
+              <w:rPr>
+                <w:b/>
+                <w:bCs/>
+              </w:rPr>
+            </w:pPr>
+            <w:r>
+              <w:rPr>
+                <w:b/>
+                <w:bCs/>
+              </w:rPr>
+              <w:t>Nazareth/</w:t>
+            </w:r>
+          </w:p>
+          <w:p>
+            <w:pPr>
+              <w:rPr>
+                <w:b/>
+                <w:bCs/>
+              </w:rPr>
+            </w:pPr>
+            <w:r>
+              <w:rPr>
+                <w:b/>
+                <w:bCs/>
+              </w:rPr>
+              <w:t>500</w:t>
+            </w:r>
+          </w:p>
+        </w:tc>
+        <w:tc>
+          <w:tcPr>
+            <w:tcW w:w="1491" w:type="dxa"/>
+          </w:tcPr>
+          <w:p>
+            <w:r>
+              <w:t>67342</w:t>
+            </w:r>
+          </w:p>
+        </w:tc>
+        <w:tc>
+          <w:tcPr>
+            <w:tcW w:w="1492" w:type="dxa"/>
+          </w:tcPr>
+          <w:p>
+            <w:r>
+              <w:t>99.8</w:t>
+            </w:r>
+          </w:p>
+        </w:tc>
+        <w:tc>
+          <w:tcPr>
+            <w:tcW w:w="1491" w:type="dxa"/>
+          </w:tcPr>
+          <w:p>
+            <w:r>
+              <w:t>99.8</w:t>
+            </w:r>
+          </w:p>
+        </w:tc>
+        <w:tc>
+          <w:tcPr>
+            <w:tcW w:w="1492" w:type="dxa"/>
+          </w:tcPr>
+          <w:p>
+            <w:r>
+              <w:t>99.8</w:t>
+            </w:r>
+          </w:p>
+        </w:tc>
+        <w:tc>
+          <w:tcPr>
+            <w:tcW w:w="1491" w:type="dxa"/>
+          </w:tcPr>
+          <w:p>
+            <w:r>
+              <w:t>69.9</w:t>
+            </w:r>
+          </w:p>
+        </w:tc>
+        <w:tc>
+          <w:tcPr>
+            <w:tcW w:w="1492" w:type="dxa"/>
+          </w:tcPr>
+          <w:p>
+            <w:r>
+              <w:t>0.0</w:t>
+            </w:r>
+          </w:p>
+        </w:tc>
+      </w:tr>
+    </w:tbl>
+    <w:p>
+      <w:pPr>
+        <w:rPr>
+          <w:b/>
+          <w:bCs/>
+          <w:sz w:val="32"/>
+          <w:szCs w:val="32"/>
+        </w:rPr>
+      </w:pPr>
+    </w:p>
+    <w:p>
+      <w:pPr>
+        <w:rPr>
+          <w:b/>
+          <w:bCs/>
+        </w:rPr>
+      </w:pPr>
+      <w:r>
+        <w:rPr>
+          <w:b/>
+          <w:bCs/>
+        </w:rPr>
+        <w:t>Time Missingness Table</w:t>
+      </w:r>
+    </w:p>
+    <w:tbl>
+      <w:tblPr>
+        <w:tblStyle w:val="TableGrid"/>
+        <w:tblW w:w="10440" w:type="dxa"/>
+        <w:tblInd w:w="-455" w:type="dxa"/>
+        <w:tblLook w:val="04A0" w:firstRow="1" w:lastRow="0" w:firstColumn="1" w:lastColumn="0" w:noHBand="0" w:noVBand="1"/>
+      </w:tblPr>
+      <w:tblGrid>
+        <w:gridCol w:w="3480"/>
+        <w:gridCol w:w="3480"/>
+        <w:gridCol w:w="3480"/>
+      </w:tblGrid>
+      <w:tr>
+        <w:tc>
+          <w:tcPr>
+            <w:tcW w:w="3480" w:type="dxa"/>
+          </w:tcPr>
+          <w:p>
+            <w:pPr>
+              <w:rPr>
+                <w:b/>
+                <w:bCs/>
+              </w:rPr>
+            </w:pPr>
+            <w:r>
+              <w:rPr>
+                <w:b/>
+                <w:bCs/>
+              </w:rPr>
+              <w:t>Station Name/ ID</w:t>
+            </w:r>
+          </w:p>
+        </w:tc>
+        <w:tc>
+          <w:tcPr>
+            <w:tcW w:w="3480" w:type="dxa"/>
+          </w:tcPr>
+          <w:p>
+            <w:pPr>
+              <w:rPr>
+                <w:b/>
+                <w:bCs/>
+              </w:rPr>
+            </w:pPr>
+            <w:r>
+              <w:rPr>
+                <w:b/>
+                <w:bCs/>
+              </w:rPr>
+              <w:t>Gap Count</w:t>
+            </w:r>
+          </w:p>
+        </w:tc>
+        <w:tc>
+          <w:tcPr>
+            <w:tcW w:w="3480" w:type="dxa"/>
+          </w:tcPr>
+          <w:p>
+            <w:pPr>
+              <w:rPr>
+                <w:b/>
+                <w:bCs/>
+              </w:rPr>
+            </w:pPr>
+            <w:r>
+              <w:rPr>
+                <w:b/>
+                <w:bCs/>
+              </w:rPr>
+              <w:t>Max Gap Hours</w:t>
+            </w:r>
+          </w:p>
+        </w:tc>
+      </w:tr>
+      <w:tr>
+        <w:tc>
+          <w:tcPr>
+            <w:tcW w:w="3480" w:type="dxa"/>
+          </w:tcPr>
+          <w:p>
+            <w:pPr>
+              <w:rPr>
+                <w:b/>
+                <w:bCs/>
+              </w:rPr>
+            </w:pPr>
+            <w:r>
+              <w:rPr>
+                <w:b/>
+                <w:bCs/>
+              </w:rPr>
+              <w:t>Tavor Kadoori/13</w:t>
+            </w:r>
+          </w:p>
+        </w:tc>
+        <w:tc>
+          <w:tcPr>
+            <w:tcW w:w="3480" w:type="dxa"/>
+          </w:tcPr>
+          <w:p>
+            <w:r>
+              <w:t>40</w:t>
+            </w:r>
+          </w:p>
+        </w:tc>
+        <w:tc>
+          <w:tcPr>
+            <w:tcW w:w="3480" w:type="dxa"/>
+          </w:tcPr>
+          <w:p>
+            <w:r>
+              <w:t>223.5</w:t>
+            </w:r>
+          </w:p>
+        </w:tc>
+      </w:tr>
+      <w:tr>
+        <w:tc>
+          <w:tcPr>
+            <w:tcW w:w="3480" w:type="dxa"/>
+          </w:tcPr>
+          <w:p>
+            <w:pPr>
+              <w:rPr>
+                <w:b/>
+                <w:bCs/>
+              </w:rPr>
+            </w:pPr>
+            <w:r>
+              <w:rPr>
+                <w:b/>
+                <w:bCs/>
+              </w:rPr>
+              <w:t>Afula Ner Haemek/16</w:t>
+            </w:r>
+          </w:p>
+        </w:tc>
+        <w:tc>
+          <w:tcPr>
+            <w:tcW w:w="3480" w:type="dxa"/>
+          </w:tcPr>
+          <w:p>
+            <w:r>
+              <w:t>9</w:t>
+            </w:r>
+          </w:p>
+        </w:tc>
+        <w:tc>
+          <w:tcPr>
+            <w:tcW w:w="3480" w:type="dxa"/>
+          </w:tcPr>
+          <w:p>
+            <w:r>
+              <w:t>13.2</w:t>
+            </w:r>
+          </w:p>
+        </w:tc>
+      </w:tr>
+      <w:tr>
+        <w:tc>
+          <w:tcPr>
+            <w:tcW w:w="3480" w:type="dxa"/>
+          </w:tcPr>
+          <w:p>
+            <w:pPr>
+              <w:rPr>
+                <w:b/>
+                <w:bCs/>
+              </w:rPr>
+            </w:pPr>
+            <w:r>
+              <w:rPr>
+                <w:b/>
+                <w:bCs/>
+              </w:rPr>
+              <w:t>Newe Yaa’r/186</w:t>
+            </w:r>
+          </w:p>
+        </w:tc>
+        <w:tc>
+          <w:tcPr>
+            <w:tcW w:w="3480" w:type="dxa"/>
+          </w:tcPr>
+          <w:p>
+            <w:r>
+              <w:t>32</w:t>
+            </w:r>
+          </w:p>
+        </w:tc>
+        <w:tc>
+          <w:tcPr>
+            <w:tcW w:w="3480" w:type="dxa"/>
+          </w:tcPr>
+          <w:p>
+            <w:r>
+              <w:t>8.5</w:t>
+            </w:r>
+          </w:p>
+        </w:tc>
+      </w:tr>
+      <w:tr>
+        <w:tc>
+          <w:tcPr>
+            <w:tcW w:w="3480" w:type="dxa"/>
+          </w:tcPr>
+          <w:p>
+            <w:pPr>
+              <w:rPr>
+                <w:b/>
+                <w:bCs/>
+              </w:rPr>
+            </w:pPr>
+            <w:r>
+              <w:rPr>
+                <w:b/>
+                <w:bCs/>
+              </w:rPr>
+              <w:t>Nazareth/500</w:t>
+            </w:r>
+          </w:p>
+        </w:tc>
+        <w:tc>
+          <w:tcPr>
+            <w:tcW w:w="3480" w:type="dxa"/>
+          </w:tcPr>
+          <w:p>
+            <w:r>
+              <w:t>1</w:t>
+            </w:r>
+          </w:p>
+        </w:tc>
+        <w:tc>
+          <w:tcPr>
+            <w:tcW w:w="3480" w:type="dxa"/>
+          </w:tcPr>
+          <w:p>
+            <w:r>
+              <w:t>1.2</w:t>
+            </w:r>
+          </w:p>
+        </w:tc>
+      </w:tr>
+    </w:tbl>
+    <w:p>
+      <w:pPr>
+        <w:rPr>
+          <w:b/>
+          <w:bCs/>
+        </w:rPr>
+      </w:pPr>
+    </w:p>
+    <w:p>
+      <w:pPr>
+        <w:rPr>
+          <w:b/>
+          <w:bCs/>
+        </w:rPr>
+      </w:pPr>
+      <w:r>
+        <w:rPr>
+          <w:b/>
+          <w:bCs/>
+        </w:rPr>
+        <w:t>Physical Validity</w:t>
+      </w:r>
+      <w:r>
+        <w:rPr>
+          <w:b/>
+          <w:bCs/>
+        </w:rPr>
+        <w:t xml:space="preserve"> Table</w:t>
+      </w:r>
+      <w:r>
+        <w:rPr>
+          <w:b/>
+          <w:bCs/>
+        </w:rPr>
+        <w:t xml:space="preserve"> (Sensor Malfunctions)</w:t>
+      </w:r>
+    </w:p>
+    <w:tbl>
+      <w:tblPr>
+        <w:tblStyle w:val="TableGrid"/>
+        <w:tblW w:w="10440" w:type="dxa"/>
+        <w:tblInd w:w="-455" w:type="dxa"/>
+        <w:tblLook w:val="04A0" w:firstRow="1" w:lastRow="0" w:firstColumn="1" w:lastColumn="0" w:noHBand="0" w:noVBand="1"/>
+      </w:tblPr>
+      <w:tblGrid>
+        <w:gridCol w:w="1688"/>
+        <w:gridCol w:w="1449"/>
+        <w:gridCol w:w="1451"/>
+        <w:gridCol w:w="1444"/>
+        <w:gridCol w:w="1457"/>
+        <w:gridCol w:w="1475"/>
+        <w:gridCol w:w="1476"/>
+      </w:tblGrid>
+      <w:tr>
+        <w:trPr>
+          <w:trHeight w:val="586"/>
+        </w:trPr>
+        <w:tc>
+          <w:tcPr>
+            <w:tcW w:w="1491" w:type="dxa"/>
+          </w:tcPr>
+          <w:p>
+            <w:pPr>
+              <w:rPr>
+                <w:b/>
+                <w:bCs/>
+              </w:rPr>
+            </w:pPr>
+            <w:r>
+              <w:rPr>
+                <w:b/>
+                <w:bCs/>
+              </w:rPr>
+              <w:t>Station Name/ID</w:t>
+            </w:r>
+          </w:p>
+        </w:tc>
+        <w:tc>
+          <w:tcPr>
+            <w:tcW w:w="1491" w:type="dxa"/>
+          </w:tcPr>
+          <w:p>
+            <w:pPr>
+              <w:rPr>
+                <w:b/>
+                <w:bCs/>
+              </w:rPr>
+            </w:pPr>
+            <w:r>
+              <w:rPr>
+                <w:b/>
+                <w:bCs/>
+              </w:rPr>
+              <w:t>Min Temp</w:t>
+            </w:r>
+          </w:p>
+        </w:tc>
+        <w:tc>
+          <w:tcPr>
+            <w:tcW w:w="1492" w:type="dxa"/>
+          </w:tcPr>
+          <w:p>
+            <w:pPr>
+              <w:rPr>
+                <w:b/>
+                <w:bCs/>
+              </w:rPr>
+            </w:pPr>
+            <w:r>
+              <w:rPr>
+                <w:b/>
+                <w:bCs/>
+              </w:rPr>
+              <w:t>Max Temp</w:t>
+            </w:r>
+          </w:p>
+        </w:tc>
+        <w:tc>
+          <w:tcPr>
+            <w:tcW w:w="1491" w:type="dxa"/>
+          </w:tcPr>
+          <w:p>
+            <w:pPr>
+              <w:rPr>
+                <w:b/>
+                <w:bCs/>
+              </w:rPr>
+            </w:pPr>
+            <w:r>
+              <w:rPr>
+                <w:b/>
+                <w:bCs/>
+              </w:rPr>
+              <w:t>Max Rain</w:t>
+            </w:r>
+          </w:p>
+        </w:tc>
+        <w:tc>
+          <w:tcPr>
+            <w:tcW w:w="1492" w:type="dxa"/>
+          </w:tcPr>
+          <w:p>
+            <w:pPr>
+              <w:rPr>
+                <w:b/>
+                <w:bCs/>
+              </w:rPr>
+            </w:pPr>
+            <w:r>
+              <w:rPr>
+                <w:b/>
+                <w:bCs/>
+              </w:rPr>
+              <w:t>Max Wind Speed</w:t>
+            </w:r>
+          </w:p>
+        </w:tc>
+        <w:tc>
+          <w:tcPr>
+            <w:tcW w:w="1491" w:type="dxa"/>
+          </w:tcPr>
+          <w:p>
+            <w:pPr>
+              <w:rPr>
+                <w:b/>
+                <w:bCs/>
+              </w:rPr>
+            </w:pPr>
+            <w:r>
+              <w:rPr>
+                <w:b/>
+                <w:bCs/>
+              </w:rPr>
+              <w:t>Min Humidity</w:t>
+            </w:r>
+          </w:p>
+        </w:tc>
+        <w:tc>
+          <w:tcPr>
+            <w:tcW w:w="1492" w:type="dxa"/>
+          </w:tcPr>
+          <w:p>
+            <w:pPr>
+              <w:rPr>
+                <w:b/>
+                <w:bCs/>
+              </w:rPr>
+            </w:pPr>
+            <w:r>
+              <w:rPr>
+                <w:b/>
+                <w:bCs/>
+              </w:rPr>
+              <w:t>Max Humidity</w:t>
+            </w:r>
+          </w:p>
+        </w:tc>
+      </w:tr>
+      <w:tr>
+        <w:trPr>
+          <w:trHeight w:val="586"/>
+        </w:trPr>
+        <w:tc>
+          <w:tcPr>
+            <w:tcW w:w="1491" w:type="dxa"/>
+          </w:tcPr>
+          <w:p>
+            <w:pPr>
+              <w:rPr>
+                <w:b/>
+                <w:bCs/>
+              </w:rPr>
+            </w:pPr>
+            <w:r>
+              <w:rPr>
+                <w:b/>
+                <w:bCs/>
+              </w:rPr>
+              <w:t>Tavor Kadoori/13</w:t>
+            </w:r>
+          </w:p>
+        </w:tc>
+        <w:tc>
+          <w:tcPr>
+            <w:tcW w:w="1491" w:type="dxa"/>
+          </w:tcPr>
+          <w:p>
+            <w:r>
+              <w:t>0.3</w:t>
+            </w:r>
+          </w:p>
+        </w:tc>
+        <w:tc>
+          <w:tcPr>
+            <w:tcW w:w="1492" w:type="dxa"/>
+          </w:tcPr>
+          <w:p>
+            <w:r>
+              <w:t>44.8</w:t>
+            </w:r>
+          </w:p>
+        </w:tc>
+        <w:tc>
+          <w:tcPr>
+            <w:tcW w:w="1491" w:type="dxa"/>
+          </w:tcPr>
+          <w:p>
+            <w:r>
+              <w:t>9.2</w:t>
+            </w:r>
+          </w:p>
+        </w:tc>
+        <w:tc>
+          <w:tcPr>
+            <w:tcW w:w="1492" w:type="dxa"/>
+          </w:tcPr>
+          <w:p>
+            <w:r>
+              <w:t>8.3</w:t>
+            </w:r>
+          </w:p>
+        </w:tc>
+        <w:tc>
+          <w:tcPr>
+            <w:tcW w:w="1491" w:type="dxa"/>
+          </w:tcPr>
+          <w:p>
+            <w:r>
+              <w:t>9</w:t>
+            </w:r>
+          </w:p>
+        </w:tc>
+        <w:tc>
+          <w:tcPr>
+            <w:tcW w:w="1492" w:type="dxa"/>
+          </w:tcPr>
+          <w:p>
+            <w:r>
+              <w:t>100</w:t>
+            </w:r>
+          </w:p>
+        </w:tc>
+      </w:tr>
+      <w:tr>
+        <w:trPr>
+          <w:trHeight w:val="586"/>
+        </w:trPr>
+        <w:tc>
+          <w:tcPr>
+            <w:tcW w:w="1491" w:type="dxa"/>
+          </w:tcPr>
+          <w:p>
+            <w:pPr>
+              <w:rPr>
+                <w:b/>
+                <w:bCs/>
+              </w:rPr>
+            </w:pPr>
+            <w:r>
+              <w:rPr>
+                <w:b/>
+                <w:bCs/>
+              </w:rPr>
+              <w:t>Afula Ner Haemek/16</w:t>
+            </w:r>
+          </w:p>
+        </w:tc>
+        <w:tc>
+          <w:tcPr>
+            <w:tcW w:w="1491" w:type="dxa"/>
+          </w:tcPr>
+          <w:p>
+            <w:r>
+              <w:t>-1.7</w:t>
+            </w:r>
+          </w:p>
+        </w:tc>
+        <w:tc>
+          <w:tcPr>
+            <w:tcW w:w="1492" w:type="dxa"/>
+          </w:tcPr>
+          <w:p>
+            <w:r>
+              <w:t>42.5</w:t>
+            </w:r>
+          </w:p>
+        </w:tc>
+        <w:tc>
+          <w:tcPr>
+            <w:tcW w:w="1491" w:type="dxa"/>
+          </w:tcPr>
+          <w:p>
+            <w:r>
+              <w:t>12.8</w:t>
+            </w:r>
+          </w:p>
+        </w:tc>
+        <w:tc>
+          <w:tcPr>
+            <w:tcW w:w="1492" w:type="dxa"/>
+          </w:tcPr>
+          <w:p>
+            <w:r>
+              <w:t>12.9</w:t>
+            </w:r>
+          </w:p>
+        </w:tc>
+        <w:tc>
+          <w:tcPr>
+            <w:tcW w:w="1491" w:type="dxa"/>
+          </w:tcPr>
+          <w:p>
+            <w:r>
+              <w:t>8</w:t>
+            </w:r>
+          </w:p>
+        </w:tc>
+        <w:tc>
+          <w:tcPr>
+            <w:tcW w:w="1492" w:type="dxa"/>
+          </w:tcPr>
+          <w:p>
+            <w:r>
+              <w:t>100</w:t>
+            </w:r>
+          </w:p>
+        </w:tc>
+      </w:tr>
+      <w:tr>
+        <w:trPr>
+          <w:trHeight w:val="586"/>
+        </w:trPr>
+        <w:tc>
+          <w:tcPr>
+            <w:tcW w:w="1491" w:type="dxa"/>
+          </w:tcPr>
+          <w:p>
+            <w:pPr>
+              <w:rPr>
+                <w:b/>
+                <w:bCs/>
+              </w:rPr>
+            </w:pPr>
+            <w:r>
+              <w:rPr>
+                <w:b/>
+                <w:bCs/>
+              </w:rPr>
+              <w:t>Newe Yaa’r/186</w:t>
+            </w:r>
+          </w:p>
+        </w:tc>
+        <w:tc>
+          <w:tcPr>
+            <w:tcW w:w="1491" w:type="dxa"/>
+          </w:tcPr>
+          <w:p>
+            <w:r>
+              <w:t>1.3</w:t>
+            </w:r>
+          </w:p>
+        </w:tc>
+        <w:tc>
+          <w:tcPr>
+            <w:tcW w:w="1492" w:type="dxa"/>
+          </w:tcPr>
+          <w:p>
+            <w:r>
+              <w:t>42.7</w:t>
+            </w:r>
+          </w:p>
+        </w:tc>
+        <w:tc>
+          <w:tcPr>
+            <w:tcW w:w="1491" w:type="dxa"/>
+          </w:tcPr>
+          <w:p>
+            <w:r>
+              <w:t>11.7</w:t>
+            </w:r>
+          </w:p>
+        </w:tc>
+        <w:tc>
+          <w:tcPr>
+            <w:tcW w:w="1492" w:type="dxa"/>
+          </w:tcPr>
+          <w:p>
+            <w:r>
+              <w:t>11</w:t>
+            </w:r>
+          </w:p>
+        </w:tc>
+        <w:tc>
+          <w:tcPr>
+            <w:tcW w:w="1491" w:type="dxa"/>
+          </w:tcPr>
+          <w:p>
+            <w:r>
+              <w:t>9</w:t>
+            </w:r>
+          </w:p>
+        </w:tc>
+        <w:tc>
+          <w:tcPr>
+            <w:tcW w:w="1492" w:type="dxa"/>
+          </w:tcPr>
+          <w:p>
+            <w:r>
+              <w:t>100</w:t>
+            </w:r>
+          </w:p>
+        </w:tc>
+      </w:tr>
+      <w:tr>
+        <w:trPr>
+          <w:trHeight w:val="586"/>
+        </w:trPr>
+        <w:tc>
+          <w:tcPr>
+            <w:tcW w:w="1491" w:type="dxa"/>
+          </w:tcPr>
+          <w:p>
+            <w:pPr>
+              <w:rPr>
+                <w:b/>
+                <w:bCs/>
+              </w:rPr>
+            </w:pPr>
+            <w:r>
+              <w:rPr>
+                <w:b/>
+                <w:bCs/>
+              </w:rPr>
+              <w:t>Nazareth/500</w:t>
+            </w:r>
+          </w:p>
+        </w:tc>
+        <w:tc>
+          <w:tcPr>
+            <w:tcW w:w="1491" w:type="dxa"/>
+          </w:tcPr>
+          <w:p>
+            <w:r>
+              <w:t>5.5</w:t>
+            </w:r>
+          </w:p>
+        </w:tc>
+        <w:tc>
+          <w:tcPr>
+            <w:tcW w:w="1492" w:type="dxa"/>
+          </w:tcPr>
+          <w:p>
+            <w:r>
+              <w:t>38.4</w:t>
+            </w:r>
+          </w:p>
+        </w:tc>
+        <w:tc>
+          <w:tcPr>
+            <w:tcW w:w="1491" w:type="dxa"/>
+          </w:tcPr>
+          <w:p>
+            <w:r>
+              <w:t>7.2</w:t>
+            </w:r>
+          </w:p>
+        </w:tc>
+        <w:tc>
+          <w:tcPr>
+            <w:tcW w:w="1492" w:type="dxa"/>
+          </w:tcPr>
+          <w:p>
+            <w:r>
+              <w:t>11.4</w:t>
+            </w:r>
+          </w:p>
+        </w:tc>
+        <w:tc>
+          <w:tcPr>
+            <w:tcW w:w="1491" w:type="dxa"/>
+          </w:tcPr>
+          <w:p>
+            <w:r>
+              <w:t>8</w:t>
+            </w:r>
+          </w:p>
+        </w:tc>
+        <w:tc>
+          <w:tcPr>
+            <w:tcW w:w="1492" w:type="dxa"/>
+          </w:tcPr>
+          <w:p>
+            <w:r>
+              <w:t>100</w:t>
+            </w:r>
+          </w:p>
+        </w:tc>
+      </w:tr>
+    </w:tbl>
+    <w:p>
+      <w:pPr>
+        <w:rPr>
+          <w:b/>
+          <w:bCs/>
+        </w:rPr>
+      </w:pPr>
+    </w:p>
     <w:sectPr>
       <w:pgSz w:w="12240" w:h="15840"/>
       <w:pgMar w:top="1440" w:right="1440" w:bottom="1440" w:left="1440" w:header="720" w:footer="720" w:gutter="0"/>
@@ -1921,6 +3352,7 @@
   <w:style w:type="character" w:default="1" w:styleId="DefaultParagraphFont">
     <w:name w:val="Default Paragraph Font"/>
     <w:uiPriority w:val="1"/>
+    <w:semiHidden/>
     <w:unhideWhenUsed/>
   </w:style>
   <w:style w:type="table" w:default="1" w:styleId="TableNormal">
@@ -2277,6 +3709,25 @@
     <w:link w:val="Footer"/>
     <w:uiPriority w:val="99"/>
     <w:rsid w:val="00FE4470"/>
+  </w:style>
+  <w:style w:type="table" w:styleId="TableGrid">
+    <w:name w:val="Table Grid"/>
+    <w:basedOn w:val="TableNormal"/>
+    <w:uiPriority w:val="39"/>
+    <w:rsid w:val="00571D57"/>
+    <w:pPr>
+      <w:spacing w:after="0" w:line="240" w:lineRule="auto"/>
+    </w:pPr>
+    <w:tblPr>
+      <w:tblBorders>
+        <w:top w:val="single" w:sz="4" w:space="0" w:color="auto"/>
+        <w:left w:val="single" w:sz="4" w:space="0" w:color="auto"/>
+        <w:bottom w:val="single" w:sz="4" w:space="0" w:color="auto"/>
+        <w:right w:val="single" w:sz="4" w:space="0" w:color="auto"/>
+        <w:insideH w:val="single" w:sz="4" w:space="0" w:color="auto"/>
+        <w:insideV w:val="single" w:sz="4" w:space="0" w:color="auto"/>
+      </w:tblBorders>
+    </w:tblPr>
   </w:style>
 </w:styles>
 </file>

</xml_diff>

<commit_message>
Updates fetching and ingesting scripts to not include metrics that are not measured or provided by the IMS anymore. Updates research word doc with basic health check for data
</commit_message>
<xml_diff>
--- a/Research.docx
+++ b/Research.docx
@@ -925,6 +925,106 @@
                 <w:b/>
                 <w:bCs/>
               </w:rPr>
+              <w:t>Haifa Technion/</w:t>
+            </w:r>
+          </w:p>
+          <w:p>
+            <w:pPr>
+              <w:rPr>
+                <w:b/>
+                <w:bCs/>
+              </w:rPr>
+            </w:pPr>
+            <w:r>
+              <w:rPr>
+                <w:b/>
+                <w:bCs/>
+              </w:rPr>
+              <w:t>43</w:t>
+            </w:r>
+          </w:p>
+        </w:tc>
+        <w:tc>
+          <w:tcPr>
+            <w:tcW w:w="1491" w:type="dxa"/>
+          </w:tcPr>
+          <w:p>
+            <w:r>
+              <w:t>262716</w:t>
+            </w:r>
+          </w:p>
+        </w:tc>
+        <w:tc>
+          <w:tcPr>
+            <w:tcW w:w="1492" w:type="dxa"/>
+          </w:tcPr>
+          <w:p>
+            <w:r>
+              <w:t>100.0</w:t>
+            </w:r>
+          </w:p>
+        </w:tc>
+        <w:tc>
+          <w:tcPr>
+            <w:tcW w:w="1491" w:type="dxa"/>
+          </w:tcPr>
+          <w:p>
+            <w:r>
+              <w:t>100.0</w:t>
+            </w:r>
+          </w:p>
+        </w:tc>
+        <w:tc>
+          <w:tcPr>
+            <w:tcW w:w="1492" w:type="dxa"/>
+          </w:tcPr>
+          <w:p>
+            <w:r>
+              <w:t>100.0</w:t>
+            </w:r>
+          </w:p>
+        </w:tc>
+        <w:tc>
+          <w:tcPr>
+            <w:tcW w:w="1491" w:type="dxa"/>
+          </w:tcPr>
+          <w:p>
+            <w:r>
+              <w:t>89.5</w:t>
+            </w:r>
+          </w:p>
+        </w:tc>
+        <w:tc>
+          <w:tcPr>
+            <w:tcW w:w="1492" w:type="dxa"/>
+          </w:tcPr>
+          <w:p>
+            <w:r>
+              <w:t>0.0</w:t>
+            </w:r>
+          </w:p>
+        </w:tc>
+      </w:tr>
+      <w:tr>
+        <w:trPr>
+          <w:trHeight w:val="879"/>
+        </w:trPr>
+        <w:tc>
+          <w:tcPr>
+            <w:tcW w:w="1491" w:type="dxa"/>
+          </w:tcPr>
+          <w:p>
+            <w:pPr>
+              <w:rPr>
+                <w:b/>
+                <w:bCs/>
+              </w:rPr>
+            </w:pPr>
+            <w:r>
+              <w:rPr>
+                <w:b/>
+                <w:bCs/>
+              </w:rPr>
               <w:t>Newe Yaa’r/186</w:t>
             </w:r>
           </w:p>
@@ -1291,7 +1391,7 @@
                 <w:b/>
                 <w:bCs/>
               </w:rPr>
-              <w:t>Newe Yaa’r/186</w:t>
+              <w:t>Haifa Technion/43</w:t>
             </w:r>
           </w:p>
         </w:tc>
@@ -1301,7 +1401,7 @@
           </w:tcPr>
           <w:p>
             <w:r>
-              <w:t>32</w:t>
+              <w:t>27</w:t>
             </w:r>
           </w:p>
         </w:tc>
@@ -1311,7 +1411,7 @@
           </w:tcPr>
           <w:p>
             <w:r>
-              <w:t>8.5</w:t>
+              <w:t>28.8</w:t>
             </w:r>
           </w:p>
         </w:tc>
@@ -1333,6 +1433,48 @@
                 <w:b/>
                 <w:bCs/>
               </w:rPr>
+              <w:t>Newe Yaa’r/186</w:t>
+            </w:r>
+          </w:p>
+        </w:tc>
+        <w:tc>
+          <w:tcPr>
+            <w:tcW w:w="3480" w:type="dxa"/>
+          </w:tcPr>
+          <w:p>
+            <w:r>
+              <w:t>32</w:t>
+            </w:r>
+          </w:p>
+        </w:tc>
+        <w:tc>
+          <w:tcPr>
+            <w:tcW w:w="3480" w:type="dxa"/>
+          </w:tcPr>
+          <w:p>
+            <w:r>
+              <w:t>8.5</w:t>
+            </w:r>
+          </w:p>
+        </w:tc>
+      </w:tr>
+      <w:tr>
+        <w:tc>
+          <w:tcPr>
+            <w:tcW w:w="3480" w:type="dxa"/>
+          </w:tcPr>
+          <w:p>
+            <w:pPr>
+              <w:rPr>
+                <w:b/>
+                <w:bCs/>
+              </w:rPr>
+            </w:pPr>
+            <w:r>
+              <w:rPr>
+                <w:b/>
+                <w:bCs/>
+              </w:rPr>
               <w:t>Nazareth/500</w:t>
             </w:r>
           </w:p>
@@ -1374,11 +1516,60 @@
           <w:bCs/>
         </w:rPr>
       </w:pPr>
-      <w:r>
-        <w:rPr>
-          <w:b/>
-          <w:bCs/>
-        </w:rPr>
+    </w:p>
+    <w:p>
+      <w:pPr>
+        <w:rPr>
+          <w:b/>
+          <w:bCs/>
+        </w:rPr>
+      </w:pPr>
+    </w:p>
+    <w:p>
+      <w:pPr>
+        <w:rPr>
+          <w:b/>
+          <w:bCs/>
+        </w:rPr>
+      </w:pPr>
+    </w:p>
+    <w:p>
+      <w:pPr>
+        <w:rPr>
+          <w:b/>
+          <w:bCs/>
+        </w:rPr>
+      </w:pPr>
+    </w:p>
+    <w:p>
+      <w:pPr>
+        <w:rPr>
+          <w:b/>
+          <w:bCs/>
+        </w:rPr>
+      </w:pPr>
+    </w:p>
+    <w:p>
+      <w:pPr>
+        <w:rPr>
+          <w:b/>
+          <w:bCs/>
+        </w:rPr>
+      </w:pPr>
+    </w:p>
+    <w:p>
+      <w:pPr>
+        <w:rPr>
+          <w:b/>
+          <w:bCs/>
+        </w:rPr>
+      </w:pPr>
+      <w:r>
+        <w:rPr>
+          <w:b/>
+          <w:bCs/>
+        </w:rPr>
+        <w:lastRenderedPageBreak/>
         <w:t>Physical Validity</w:t>
       </w:r>
       <w:r>
@@ -1418,7 +1609,7 @@
         </w:trPr>
         <w:tc>
           <w:tcPr>
-            <w:tcW w:w="1491" w:type="dxa"/>
+            <w:tcW w:w="1688" w:type="dxa"/>
           </w:tcPr>
           <w:p>
             <w:pPr>
@@ -1438,7 +1629,7 @@
         </w:tc>
         <w:tc>
           <w:tcPr>
-            <w:tcW w:w="1491" w:type="dxa"/>
+            <w:tcW w:w="1449" w:type="dxa"/>
           </w:tcPr>
           <w:p>
             <w:pPr>
@@ -1458,7 +1649,7 @@
         </w:tc>
         <w:tc>
           <w:tcPr>
-            <w:tcW w:w="1492" w:type="dxa"/>
+            <w:tcW w:w="1451" w:type="dxa"/>
           </w:tcPr>
           <w:p>
             <w:pPr>
@@ -1478,7 +1669,7 @@
         </w:tc>
         <w:tc>
           <w:tcPr>
-            <w:tcW w:w="1491" w:type="dxa"/>
+            <w:tcW w:w="1444" w:type="dxa"/>
           </w:tcPr>
           <w:p>
             <w:pPr>
@@ -1498,7 +1689,7 @@
         </w:tc>
         <w:tc>
           <w:tcPr>
-            <w:tcW w:w="1492" w:type="dxa"/>
+            <w:tcW w:w="1457" w:type="dxa"/>
           </w:tcPr>
           <w:p>
             <w:pPr>
@@ -1518,7 +1709,7 @@
         </w:tc>
         <w:tc>
           <w:tcPr>
-            <w:tcW w:w="1491" w:type="dxa"/>
+            <w:tcW w:w="1475" w:type="dxa"/>
           </w:tcPr>
           <w:p>
             <w:pPr>
@@ -1538,7 +1729,7 @@
         </w:tc>
         <w:tc>
           <w:tcPr>
-            <w:tcW w:w="1492" w:type="dxa"/>
+            <w:tcW w:w="1476" w:type="dxa"/>
           </w:tcPr>
           <w:p>
             <w:pPr>
@@ -1563,7 +1754,7 @@
         </w:trPr>
         <w:tc>
           <w:tcPr>
-            <w:tcW w:w="1491" w:type="dxa"/>
+            <w:tcW w:w="1688" w:type="dxa"/>
           </w:tcPr>
           <w:p>
             <w:pPr>
@@ -1583,7 +1774,7 @@
         </w:tc>
         <w:tc>
           <w:tcPr>
-            <w:tcW w:w="1491" w:type="dxa"/>
+            <w:tcW w:w="1449" w:type="dxa"/>
           </w:tcPr>
           <w:p>
             <w:r>
@@ -1593,7 +1784,7 @@
         </w:tc>
         <w:tc>
           <w:tcPr>
-            <w:tcW w:w="1492" w:type="dxa"/>
+            <w:tcW w:w="1451" w:type="dxa"/>
           </w:tcPr>
           <w:p>
             <w:r>
@@ -1603,7 +1794,7 @@
         </w:tc>
         <w:tc>
           <w:tcPr>
-            <w:tcW w:w="1491" w:type="dxa"/>
+            <w:tcW w:w="1444" w:type="dxa"/>
           </w:tcPr>
           <w:p>
             <w:r>
@@ -1613,7 +1804,7 @@
         </w:tc>
         <w:tc>
           <w:tcPr>
-            <w:tcW w:w="1492" w:type="dxa"/>
+            <w:tcW w:w="1457" w:type="dxa"/>
           </w:tcPr>
           <w:p>
             <w:r>
@@ -1623,7 +1814,7 @@
         </w:tc>
         <w:tc>
           <w:tcPr>
-            <w:tcW w:w="1491" w:type="dxa"/>
+            <w:tcW w:w="1475" w:type="dxa"/>
           </w:tcPr>
           <w:p>
             <w:r>
@@ -1633,7 +1824,7 @@
         </w:tc>
         <w:tc>
           <w:tcPr>
-            <w:tcW w:w="1492" w:type="dxa"/>
+            <w:tcW w:w="1476" w:type="dxa"/>
           </w:tcPr>
           <w:p>
             <w:r>
@@ -1648,7 +1839,7 @@
         </w:trPr>
         <w:tc>
           <w:tcPr>
-            <w:tcW w:w="1491" w:type="dxa"/>
+            <w:tcW w:w="1688" w:type="dxa"/>
           </w:tcPr>
           <w:p>
             <w:pPr>
@@ -1668,7 +1859,7 @@
         </w:tc>
         <w:tc>
           <w:tcPr>
-            <w:tcW w:w="1491" w:type="dxa"/>
+            <w:tcW w:w="1449" w:type="dxa"/>
           </w:tcPr>
           <w:p>
             <w:r>
@@ -1678,7 +1869,7 @@
         </w:tc>
         <w:tc>
           <w:tcPr>
-            <w:tcW w:w="1492" w:type="dxa"/>
+            <w:tcW w:w="1451" w:type="dxa"/>
           </w:tcPr>
           <w:p>
             <w:r>
@@ -1688,7 +1879,7 @@
         </w:tc>
         <w:tc>
           <w:tcPr>
-            <w:tcW w:w="1491" w:type="dxa"/>
+            <w:tcW w:w="1444" w:type="dxa"/>
           </w:tcPr>
           <w:p>
             <w:r>
@@ -1698,7 +1889,7 @@
         </w:tc>
         <w:tc>
           <w:tcPr>
-            <w:tcW w:w="1492" w:type="dxa"/>
+            <w:tcW w:w="1457" w:type="dxa"/>
           </w:tcPr>
           <w:p>
             <w:r>
@@ -1708,7 +1899,7 @@
         </w:tc>
         <w:tc>
           <w:tcPr>
-            <w:tcW w:w="1491" w:type="dxa"/>
+            <w:tcW w:w="1475" w:type="dxa"/>
           </w:tcPr>
           <w:p>
             <w:r>
@@ -1718,7 +1909,7 @@
         </w:tc>
         <w:tc>
           <w:tcPr>
-            <w:tcW w:w="1492" w:type="dxa"/>
+            <w:tcW w:w="1476" w:type="dxa"/>
           </w:tcPr>
           <w:p>
             <w:r>
@@ -1733,7 +1924,7 @@
         </w:trPr>
         <w:tc>
           <w:tcPr>
-            <w:tcW w:w="1491" w:type="dxa"/>
+            <w:tcW w:w="1688" w:type="dxa"/>
           </w:tcPr>
           <w:p>
             <w:pPr>
@@ -1747,67 +1938,67 @@
                 <w:b/>
                 <w:bCs/>
               </w:rPr>
-              <w:t>Newe Yaa’r/186</w:t>
-            </w:r>
-          </w:p>
-        </w:tc>
-        <w:tc>
-          <w:tcPr>
-            <w:tcW w:w="1491" w:type="dxa"/>
-          </w:tcPr>
-          <w:p>
-            <w:r>
-              <w:t>1.3</w:t>
-            </w:r>
-          </w:p>
-        </w:tc>
-        <w:tc>
-          <w:tcPr>
-            <w:tcW w:w="1492" w:type="dxa"/>
-          </w:tcPr>
-          <w:p>
-            <w:r>
-              <w:t>42.7</w:t>
-            </w:r>
-          </w:p>
-        </w:tc>
-        <w:tc>
-          <w:tcPr>
-            <w:tcW w:w="1491" w:type="dxa"/>
-          </w:tcPr>
-          <w:p>
-            <w:r>
-              <w:t>11.7</w:t>
-            </w:r>
-          </w:p>
-        </w:tc>
-        <w:tc>
-          <w:tcPr>
-            <w:tcW w:w="1492" w:type="dxa"/>
-          </w:tcPr>
-          <w:p>
-            <w:r>
-              <w:t>11</w:t>
-            </w:r>
-          </w:p>
-        </w:tc>
-        <w:tc>
-          <w:tcPr>
-            <w:tcW w:w="1491" w:type="dxa"/>
-          </w:tcPr>
-          <w:p>
-            <w:r>
-              <w:t>9</w:t>
-            </w:r>
-          </w:p>
-        </w:tc>
-        <w:tc>
-          <w:tcPr>
-            <w:tcW w:w="1492" w:type="dxa"/>
-          </w:tcPr>
-          <w:p>
-            <w:r>
-              <w:t>100</w:t>
+              <w:t>Haifa Technion/43</w:t>
+            </w:r>
+          </w:p>
+        </w:tc>
+        <w:tc>
+          <w:tcPr>
+            <w:tcW w:w="1449" w:type="dxa"/>
+          </w:tcPr>
+          <w:p>
+            <w:r>
+              <w:t>3.8</w:t>
+            </w:r>
+          </w:p>
+        </w:tc>
+        <w:tc>
+          <w:tcPr>
+            <w:tcW w:w="1451" w:type="dxa"/>
+          </w:tcPr>
+          <w:p>
+            <w:r>
+              <w:t>39.6</w:t>
+            </w:r>
+          </w:p>
+        </w:tc>
+        <w:tc>
+          <w:tcPr>
+            <w:tcW w:w="1444" w:type="dxa"/>
+          </w:tcPr>
+          <w:p>
+            <w:r>
+              <w:t>15</w:t>
+            </w:r>
+          </w:p>
+        </w:tc>
+        <w:tc>
+          <w:tcPr>
+            <w:tcW w:w="1457" w:type="dxa"/>
+          </w:tcPr>
+          <w:p>
+            <w:r>
+              <w:t>10.9</w:t>
+            </w:r>
+          </w:p>
+        </w:tc>
+        <w:tc>
+          <w:tcPr>
+            <w:tcW w:w="1475" w:type="dxa"/>
+          </w:tcPr>
+          <w:p>
+            <w:r>
+              <w:t>10</w:t>
+            </w:r>
+          </w:p>
+        </w:tc>
+        <w:tc>
+          <w:tcPr>
+            <w:tcW w:w="1476" w:type="dxa"/>
+          </w:tcPr>
+          <w:p>
+            <w:r>
+              <w:t>99</w:t>
             </w:r>
           </w:p>
         </w:tc>
@@ -1818,7 +2009,7 @@
         </w:trPr>
         <w:tc>
           <w:tcPr>
-            <w:tcW w:w="1491" w:type="dxa"/>
+            <w:tcW w:w="1688" w:type="dxa"/>
           </w:tcPr>
           <w:p>
             <w:pPr>
@@ -1832,13 +2023,98 @@
                 <w:b/>
                 <w:bCs/>
               </w:rPr>
+              <w:t>Newe Yaa’r/186</w:t>
+            </w:r>
+          </w:p>
+        </w:tc>
+        <w:tc>
+          <w:tcPr>
+            <w:tcW w:w="1449" w:type="dxa"/>
+          </w:tcPr>
+          <w:p>
+            <w:r>
+              <w:t>1.3</w:t>
+            </w:r>
+          </w:p>
+        </w:tc>
+        <w:tc>
+          <w:tcPr>
+            <w:tcW w:w="1451" w:type="dxa"/>
+          </w:tcPr>
+          <w:p>
+            <w:r>
+              <w:t>42.7</w:t>
+            </w:r>
+          </w:p>
+        </w:tc>
+        <w:tc>
+          <w:tcPr>
+            <w:tcW w:w="1444" w:type="dxa"/>
+          </w:tcPr>
+          <w:p>
+            <w:r>
+              <w:t>11.7</w:t>
+            </w:r>
+          </w:p>
+        </w:tc>
+        <w:tc>
+          <w:tcPr>
+            <w:tcW w:w="1457" w:type="dxa"/>
+          </w:tcPr>
+          <w:p>
+            <w:r>
+              <w:t>11</w:t>
+            </w:r>
+          </w:p>
+        </w:tc>
+        <w:tc>
+          <w:tcPr>
+            <w:tcW w:w="1475" w:type="dxa"/>
+          </w:tcPr>
+          <w:p>
+            <w:r>
+              <w:t>9</w:t>
+            </w:r>
+          </w:p>
+        </w:tc>
+        <w:tc>
+          <w:tcPr>
+            <w:tcW w:w="1476" w:type="dxa"/>
+          </w:tcPr>
+          <w:p>
+            <w:r>
+              <w:t>100</w:t>
+            </w:r>
+          </w:p>
+        </w:tc>
+      </w:tr>
+      <w:tr>
+        <w:trPr>
+          <w:trHeight w:val="586"/>
+        </w:trPr>
+        <w:tc>
+          <w:tcPr>
+            <w:tcW w:w="1688" w:type="dxa"/>
+          </w:tcPr>
+          <w:p>
+            <w:pPr>
+              <w:rPr>
+                <w:b/>
+                <w:bCs/>
+              </w:rPr>
+            </w:pPr>
+            <w:r>
+              <w:rPr>
+                <w:b/>
+                <w:bCs/>
+              </w:rPr>
               <w:t>Nazareth/500</w:t>
             </w:r>
           </w:p>
         </w:tc>
         <w:tc>
           <w:tcPr>
-            <w:tcW w:w="1491" w:type="dxa"/>
+            <w:tcW w:w="1449" w:type="dxa"/>
           </w:tcPr>
           <w:p>
             <w:r>
@@ -1848,7 +2124,7 @@
         </w:tc>
         <w:tc>
           <w:tcPr>
-            <w:tcW w:w="1492" w:type="dxa"/>
+            <w:tcW w:w="1451" w:type="dxa"/>
           </w:tcPr>
           <w:p>
             <w:r>
@@ -1858,7 +2134,7 @@
         </w:tc>
         <w:tc>
           <w:tcPr>
-            <w:tcW w:w="1491" w:type="dxa"/>
+            <w:tcW w:w="1444" w:type="dxa"/>
           </w:tcPr>
           <w:p>
             <w:r>
@@ -1868,7 +2144,7 @@
         </w:tc>
         <w:tc>
           <w:tcPr>
-            <w:tcW w:w="1492" w:type="dxa"/>
+            <w:tcW w:w="1457" w:type="dxa"/>
           </w:tcPr>
           <w:p>
             <w:r>
@@ -1878,7 +2154,7 @@
         </w:tc>
         <w:tc>
           <w:tcPr>
-            <w:tcW w:w="1491" w:type="dxa"/>
+            <w:tcW w:w="1475" w:type="dxa"/>
           </w:tcPr>
           <w:p>
             <w:r>
@@ -1888,7 +2164,7 @@
         </w:tc>
         <w:tc>
           <w:tcPr>
-            <w:tcW w:w="1492" w:type="dxa"/>
+            <w:tcW w:w="1476" w:type="dxa"/>
           </w:tcPr>
           <w:p>
             <w:r>

</xml_diff>

<commit_message>
Changes python version to 3.11 to support new dependencies, Adds telaviv coast weather station data to database for wind convergence calculations later, updates research word doc with telaviv coast station data.
</commit_message>
<xml_diff>
--- a/Research.docx
+++ b/Research.docx
@@ -63,7 +63,15 @@
     </w:p>
     <w:p>
       <w:r>
-        <w:t xml:space="preserve">The proposed Spatio-Temporal Precipitation Forecasting pipeline is based on the </w:t>
+        <w:t xml:space="preserve">The proposed </w:t>
+      </w:r>
+      <w:proofErr w:type="spellStart"/>
+      <w:r>
+        <w:t>Spatio</w:t>
+      </w:r>
+      <w:proofErr w:type="spellEnd"/>
+      <w:r>
+        <w:t xml:space="preserve">-Temporal Precipitation Forecasting pipeline is based on the </w:t>
       </w:r>
       <w:r>
         <w:rPr>
@@ -157,9 +165,11 @@
       <w:r>
         <w:t>(</w:t>
       </w:r>
+      <w:proofErr w:type="spellStart"/>
       <w:r>
         <w:t>RFsp</w:t>
       </w:r>
+      <w:proofErr w:type="spellEnd"/>
       <w:r>
         <w:t>), making it ideal for generating high-resolution operational forecast maps.</w:t>
       </w:r>
@@ -191,11 +201,21 @@
       <w:r>
         <w:t xml:space="preserve"> (</w:t>
       </w:r>
+      <w:proofErr w:type="spellStart"/>
       <w:r>
         <w:t>Rain_at_Neighbor_k</w:t>
       </w:r>
-      <w:r>
-        <w:t>) directly as covariates. This approach, which mirrors the fundamental principle of geostatistical methods like Kriging, was previously overlooked in other machine learning spatial models. This feature design allows the model to inherently learn and non-linearly map the localized spatial autocorrelation, which is essential for accurate interpolation.</w:t>
+      <w:proofErr w:type="spellEnd"/>
+      <w:r>
+        <w:t xml:space="preserve">) directly as covariates. This approach, which mirrors the fundamental principle of geostatistical methods like Kriging, was previously overlooked in other </w:t>
+      </w:r>
+      <w:proofErr w:type="gramStart"/>
+      <w:r>
+        <w:t>machine</w:t>
+      </w:r>
+      <w:proofErr w:type="gramEnd"/>
+      <w:r>
+        <w:t xml:space="preserve"> learning spatial models. This feature design allows the model to inherently learn and non-linearly map the localized spatial autocorrelation, which is essential for accurate interpolation.</w:t>
       </w:r>
     </w:p>
     <w:p>
@@ -318,7 +338,31 @@
         </w:numPr>
       </w:pPr>
       <w:r>
-        <w:t>Static Features: DEM_at_S, Slope_at_S, Dist_to_Coast_S.</w:t>
+        <w:t xml:space="preserve">Static Features: </w:t>
+      </w:r>
+      <w:proofErr w:type="spellStart"/>
+      <w:r>
+        <w:t>DEM_at_S</w:t>
+      </w:r>
+      <w:proofErr w:type="spellEnd"/>
+      <w:r>
+        <w:t xml:space="preserve">, </w:t>
+      </w:r>
+      <w:proofErr w:type="spellStart"/>
+      <w:r>
+        <w:t>Slope_at_S</w:t>
+      </w:r>
+      <w:proofErr w:type="spellEnd"/>
+      <w:r>
+        <w:t xml:space="preserve">, </w:t>
+      </w:r>
+      <w:proofErr w:type="spellStart"/>
+      <w:r>
+        <w:t>Dist_to_Coast_S</w:t>
+      </w:r>
+      <w:proofErr w:type="spellEnd"/>
+      <w:r>
+        <w:t>.</w:t>
       </w:r>
     </w:p>
     <w:p>
@@ -335,7 +379,15 @@
     </w:p>
     <w:p>
       <w:r>
-        <w:t>Train the Random Forest or XGBoost on a dataset of the combined station's data so that the models learn the complex relationship between the physical features, time lags, and the local spatial context.</w:t>
+        <w:t xml:space="preserve">Train the Random Forest or </w:t>
+      </w:r>
+      <w:proofErr w:type="spellStart"/>
+      <w:r>
+        <w:t>XGBoost</w:t>
+      </w:r>
+      <w:proofErr w:type="spellEnd"/>
+      <w:r>
+        <w:t xml:space="preserve"> on a dataset of the combined station's data so that the models learn the complex relationship between the physical features, time lags, and the local spatial context.</w:t>
       </w:r>
     </w:p>
     <w:p>
@@ -370,8 +422,29 @@
         </w:numPr>
       </w:pPr>
       <w:r>
-        <w:t>Static Features: DEM_at_S, Slope_at_S, Dist_to_Coast_S</w:t>
-      </w:r>
+        <w:t xml:space="preserve">Static Features: </w:t>
+      </w:r>
+      <w:proofErr w:type="spellStart"/>
+      <w:r>
+        <w:t>DEM_at_S</w:t>
+      </w:r>
+      <w:proofErr w:type="spellEnd"/>
+      <w:r>
+        <w:t xml:space="preserve">, </w:t>
+      </w:r>
+      <w:proofErr w:type="spellStart"/>
+      <w:r>
+        <w:t>Slope_at_S</w:t>
+      </w:r>
+      <w:proofErr w:type="spellEnd"/>
+      <w:r>
+        <w:t xml:space="preserve">, </w:t>
+      </w:r>
+      <w:proofErr w:type="spellStart"/>
+      <w:r>
+        <w:t>Dist_to_Coast_S</w:t>
+      </w:r>
+      <w:proofErr w:type="spellEnd"/>
     </w:p>
     <w:p>
       <w:pPr>
@@ -402,7 +475,15 @@
     </w:p>
     <w:p>
       <w:r>
-        <w:t>Use the trained Random Forest/XGBoost model to predict the precipitation forecast for each cell on the grid.</w:t>
+        <w:t>Use the trained Random Forest/</w:t>
+      </w:r>
+      <w:proofErr w:type="spellStart"/>
+      <w:r>
+        <w:t>XGBoost</w:t>
+      </w:r>
+      <w:proofErr w:type="spellEnd"/>
+      <w:r>
+        <w:t xml:space="preserve"> model to predict the precipitation forecast for each cell on the grid.</w:t>
       </w:r>
     </w:p>
     <w:p>
@@ -447,7 +528,15 @@
     </w:p>
     <w:p>
       <w:r>
-        <w:t>For the project I wanted to interpolate the weather data between the Nazareth, Afula and Iksal stations, after doing research on the available data of these stations it turns out that:</w:t>
+        <w:t xml:space="preserve">For the project I wanted to interpolate the weather data between the Nazareth, Afula and </w:t>
+      </w:r>
+      <w:proofErr w:type="spellStart"/>
+      <w:r>
+        <w:t>Iksal</w:t>
+      </w:r>
+      <w:proofErr w:type="spellEnd"/>
+      <w:r>
+        <w:t xml:space="preserve"> stations, after doing research on the available data of these stations it turns out that:</w:t>
       </w:r>
     </w:p>
     <w:p>
@@ -468,7 +557,15 @@
         <w:t>th</w:t>
       </w:r>
       <w:r>
-        <w:t xml:space="preserve"> of march 2024 up to the current date.</w:t>
+        <w:t xml:space="preserve"> of </w:t>
+      </w:r>
+      <w:proofErr w:type="gramStart"/>
+      <w:r>
+        <w:t>march</w:t>
+      </w:r>
+      <w:proofErr w:type="gramEnd"/>
+      <w:r>
+        <w:t xml:space="preserve"> 2024 up to the current date.</w:t>
       </w:r>
     </w:p>
     <w:p>
@@ -479,13 +576,26 @@
           <w:numId w:val="6"/>
         </w:numPr>
       </w:pPr>
-      <w:r>
-        <w:t>Iksal and other stations labelled as (agricultural) are not available through the IMS API endpoints.</w:t>
+      <w:proofErr w:type="spellStart"/>
+      <w:r>
+        <w:t>Iksal</w:t>
+      </w:r>
+      <w:proofErr w:type="spellEnd"/>
+      <w:r>
+        <w:t xml:space="preserve"> and other stations labelled as (agricultural) are not available through the IMS API endpoints.</w:t>
       </w:r>
     </w:p>
     <w:p>
       <w:r>
-        <w:t>My proposed solution for this problem is to use other neighboring stations like Afula, Tavor, Afeq, Haifa Refineries, Haifa University, Haifa Technion, Haifa Port. All these stations provide current and historical data up to the year ~1994 which is more than enough, my plan is to use the past 5 years of data, use the first 3-4 years from 2020-2023 as training data and then for the latest year in the data 2024-2025 utilize the Nazareth station as a holdout validation station in order to evaluate the interpolation performance of my model. This solution addresses the lack of historical data provided by the Nazareth station and the evaluation method for the interpolated high-resolution forecast by providing a source of truth station inside the interpolated grid.</w:t>
+        <w:t xml:space="preserve">My proposed solution for this problem is to use other neighboring stations like Afula, Tavor, </w:t>
+      </w:r>
+      <w:proofErr w:type="spellStart"/>
+      <w:r>
+        <w:t>Afeq</w:t>
+      </w:r>
+      <w:proofErr w:type="spellEnd"/>
+      <w:r>
+        <w:t>, Haifa Refineries, Haifa University, Haifa Technion, Haifa Port. All these stations provide current and historical data up to the year ~1994 which is more than enough, my plan is to use the past 5 years of data, use the first 3-4 years from 2020-2023 as training data and then for the latest year in the data 2024-2025 utilize the Nazareth station as a holdout validation station in order to evaluate the interpolation performance of my model. This solution addresses the lack of historical data provided by the Nazareth station and the evaluation method for the interpolated high-resolution forecast by providing a source of truth station inside the interpolated grid.</w:t>
       </w:r>
     </w:p>
     <w:p>
@@ -519,7 +629,15 @@
     </w:p>
     <w:p>
       <w:r>
-        <w:t>The IMS reports on their API page that they offer the Barometric Pressure (BP) measurements. However, upon further investigation I found that no station offers barometric pressure measurements. Barometric pressure is important because it’s a high indicator of precipitation, high pressure is associated with sinking, cold, dense air that typically leads to clear calm weather. Low pressure is associated with rising, warm, less dense air, which is often linked to cloudiness and precipitation.</w:t>
+        <w:t xml:space="preserve">The IMS reports on their API page that they offer </w:t>
+      </w:r>
+      <w:proofErr w:type="gramStart"/>
+      <w:r>
+        <w:t>the Barometric</w:t>
+      </w:r>
+      <w:proofErr w:type="gramEnd"/>
+      <w:r>
+        <w:t xml:space="preserve"> Pressure (BP) measurements. However, upon further investigation I found that no station offers barometric pressure measurements. Barometric pressure is important because it’s a high indicator of precipitation, high pressure is associated with sinking, cold, dense air that typically leads to clear calm weather. Low pressure is associated with rising, warm, less dense air, which is often linked to cloudiness and precipitation.</w:t>
       </w:r>
     </w:p>
     <w:p>
@@ -755,7 +873,23 @@
                 <w:b/>
                 <w:bCs/>
               </w:rPr>
-              <w:t>Tavor Kadoori/13</w:t>
+              <w:t xml:space="preserve">Tavor </w:t>
+            </w:r>
+            <w:proofErr w:type="spellStart"/>
+            <w:r>
+              <w:rPr>
+                <w:b/>
+                <w:bCs/>
+              </w:rPr>
+              <w:t>Kadoori</w:t>
+            </w:r>
+            <w:proofErr w:type="spellEnd"/>
+            <w:r>
+              <w:rPr>
+                <w:b/>
+                <w:bCs/>
+              </w:rPr>
+              <w:t>/13</w:t>
             </w:r>
           </w:p>
         </w:tc>
@@ -840,7 +974,23 @@
                 <w:b/>
                 <w:bCs/>
               </w:rPr>
-              <w:t>Afula Ner Haemek/16</w:t>
+              <w:t xml:space="preserve">Afula Ner </w:t>
+            </w:r>
+            <w:proofErr w:type="spellStart"/>
+            <w:r>
+              <w:rPr>
+                <w:b/>
+                <w:bCs/>
+              </w:rPr>
+              <w:t>Haemek</w:t>
+            </w:r>
+            <w:proofErr w:type="spellEnd"/>
+            <w:r>
+              <w:rPr>
+                <w:b/>
+                <w:bCs/>
+              </w:rPr>
+              <w:t>/16</w:t>
             </w:r>
           </w:p>
         </w:tc>
@@ -1020,12 +1170,131 @@
                 <w:bCs/>
               </w:rPr>
             </w:pPr>
-            <w:r>
-              <w:rPr>
-                <w:b/>
-                <w:bCs/>
-              </w:rPr>
-              <w:t>Newe Yaa’r/186</w:t>
+            <w:proofErr w:type="spellStart"/>
+            <w:r>
+              <w:rPr>
+                <w:b/>
+                <w:bCs/>
+              </w:rPr>
+              <w:t>TelAviv</w:t>
+            </w:r>
+            <w:proofErr w:type="spellEnd"/>
+            <w:r>
+              <w:rPr>
+                <w:b/>
+                <w:bCs/>
+              </w:rPr>
+              <w:t xml:space="preserve"> Coast/178</w:t>
+            </w:r>
+          </w:p>
+        </w:tc>
+        <w:tc>
+          <w:tcPr>
+            <w:tcW w:w="1491" w:type="dxa"/>
+          </w:tcPr>
+          <w:p>
+            <w:r>
+              <w:t>262553</w:t>
+            </w:r>
+          </w:p>
+        </w:tc>
+        <w:tc>
+          <w:tcPr>
+            <w:tcW w:w="1492" w:type="dxa"/>
+          </w:tcPr>
+          <w:p>
+            <w:r>
+              <w:t>100.0</w:t>
+            </w:r>
+          </w:p>
+        </w:tc>
+        <w:tc>
+          <w:tcPr>
+            <w:tcW w:w="1491" w:type="dxa"/>
+          </w:tcPr>
+          <w:p>
+            <w:r>
+              <w:t>99.5</w:t>
+            </w:r>
+          </w:p>
+        </w:tc>
+        <w:tc>
+          <w:tcPr>
+            <w:tcW w:w="1492" w:type="dxa"/>
+          </w:tcPr>
+          <w:p>
+            <w:r>
+              <w:t>99.5</w:t>
+            </w:r>
+          </w:p>
+        </w:tc>
+        <w:tc>
+          <w:tcPr>
+            <w:tcW w:w="1491" w:type="dxa"/>
+          </w:tcPr>
+          <w:p>
+            <w:r>
+              <w:t>99.6</w:t>
+            </w:r>
+          </w:p>
+        </w:tc>
+        <w:tc>
+          <w:tcPr>
+            <w:tcW w:w="1492" w:type="dxa"/>
+          </w:tcPr>
+          <w:p>
+            <w:r>
+              <w:t>0.0</w:t>
+            </w:r>
+          </w:p>
+        </w:tc>
+      </w:tr>
+      <w:tr>
+        <w:trPr>
+          <w:trHeight w:val="879"/>
+        </w:trPr>
+        <w:tc>
+          <w:tcPr>
+            <w:tcW w:w="1491" w:type="dxa"/>
+          </w:tcPr>
+          <w:p>
+            <w:pPr>
+              <w:rPr>
+                <w:b/>
+                <w:bCs/>
+              </w:rPr>
+            </w:pPr>
+            <w:proofErr w:type="spellStart"/>
+            <w:r>
+              <w:rPr>
+                <w:b/>
+                <w:bCs/>
+              </w:rPr>
+              <w:t>Newe</w:t>
+            </w:r>
+            <w:proofErr w:type="spellEnd"/>
+            <w:r>
+              <w:rPr>
+                <w:b/>
+                <w:bCs/>
+              </w:rPr>
+              <w:t xml:space="preserve"> </w:t>
+            </w:r>
+            <w:proofErr w:type="spellStart"/>
+            <w:r>
+              <w:rPr>
+                <w:b/>
+                <w:bCs/>
+              </w:rPr>
+              <w:t>Yaa’r</w:t>
+            </w:r>
+            <w:proofErr w:type="spellEnd"/>
+            <w:r>
+              <w:rPr>
+                <w:b/>
+                <w:bCs/>
+              </w:rPr>
+              <w:t>/186</w:t>
             </w:r>
           </w:p>
         </w:tc>
@@ -1307,7 +1576,23 @@
                 <w:b/>
                 <w:bCs/>
               </w:rPr>
-              <w:t>Tavor Kadoori/13</w:t>
+              <w:t xml:space="preserve">Tavor </w:t>
+            </w:r>
+            <w:proofErr w:type="spellStart"/>
+            <w:r>
+              <w:rPr>
+                <w:b/>
+                <w:bCs/>
+              </w:rPr>
+              <w:t>Kadoori</w:t>
+            </w:r>
+            <w:proofErr w:type="spellEnd"/>
+            <w:r>
+              <w:rPr>
+                <w:b/>
+                <w:bCs/>
+              </w:rPr>
+              <w:t>/13</w:t>
             </w:r>
           </w:p>
         </w:tc>
@@ -1349,7 +1634,23 @@
                 <w:b/>
                 <w:bCs/>
               </w:rPr>
-              <w:t>Afula Ner Haemek/16</w:t>
+              <w:t xml:space="preserve">Afula Ner </w:t>
+            </w:r>
+            <w:proofErr w:type="spellStart"/>
+            <w:r>
+              <w:rPr>
+                <w:b/>
+                <w:bCs/>
+              </w:rPr>
+              <w:t>Haemek</w:t>
+            </w:r>
+            <w:proofErr w:type="spellEnd"/>
+            <w:r>
+              <w:rPr>
+                <w:b/>
+                <w:bCs/>
+              </w:rPr>
+              <w:t>/16</w:t>
             </w:r>
           </w:p>
         </w:tc>
@@ -1428,12 +1729,21 @@
                 <w:bCs/>
               </w:rPr>
             </w:pPr>
-            <w:r>
-              <w:rPr>
-                <w:b/>
-                <w:bCs/>
-              </w:rPr>
-              <w:t>Newe Yaa’r/186</w:t>
+            <w:proofErr w:type="spellStart"/>
+            <w:r>
+              <w:rPr>
+                <w:b/>
+                <w:bCs/>
+              </w:rPr>
+              <w:t>TelAviv</w:t>
+            </w:r>
+            <w:proofErr w:type="spellEnd"/>
+            <w:r>
+              <w:rPr>
+                <w:b/>
+                <w:bCs/>
+              </w:rPr>
+              <w:t xml:space="preserve"> Coast/178</w:t>
             </w:r>
           </w:p>
         </w:tc>
@@ -1453,7 +1763,7 @@
           </w:tcPr>
           <w:p>
             <w:r>
-              <w:t>8.5</w:t>
+              <w:t>56.3</w:t>
             </w:r>
           </w:p>
         </w:tc>
@@ -1470,6 +1780,73 @@
                 <w:bCs/>
               </w:rPr>
             </w:pPr>
+            <w:proofErr w:type="spellStart"/>
+            <w:r>
+              <w:rPr>
+                <w:b/>
+                <w:bCs/>
+              </w:rPr>
+              <w:t>Newe</w:t>
+            </w:r>
+            <w:proofErr w:type="spellEnd"/>
+            <w:r>
+              <w:rPr>
+                <w:b/>
+                <w:bCs/>
+              </w:rPr>
+              <w:t xml:space="preserve"> </w:t>
+            </w:r>
+            <w:proofErr w:type="spellStart"/>
+            <w:r>
+              <w:rPr>
+                <w:b/>
+                <w:bCs/>
+              </w:rPr>
+              <w:t>Yaa’r</w:t>
+            </w:r>
+            <w:proofErr w:type="spellEnd"/>
+            <w:r>
+              <w:rPr>
+                <w:b/>
+                <w:bCs/>
+              </w:rPr>
+              <w:t>/186</w:t>
+            </w:r>
+          </w:p>
+        </w:tc>
+        <w:tc>
+          <w:tcPr>
+            <w:tcW w:w="3480" w:type="dxa"/>
+          </w:tcPr>
+          <w:p>
+            <w:r>
+              <w:t>32</w:t>
+            </w:r>
+          </w:p>
+        </w:tc>
+        <w:tc>
+          <w:tcPr>
+            <w:tcW w:w="3480" w:type="dxa"/>
+          </w:tcPr>
+          <w:p>
+            <w:r>
+              <w:t>8.5</w:t>
+            </w:r>
+          </w:p>
+        </w:tc>
+      </w:tr>
+      <w:tr>
+        <w:tc>
+          <w:tcPr>
+            <w:tcW w:w="3480" w:type="dxa"/>
+          </w:tcPr>
+          <w:p>
+            <w:pPr>
+              <w:rPr>
+                <w:b/>
+                <w:bCs/>
+              </w:rPr>
+            </w:pPr>
             <w:r>
               <w:rPr>
                 <w:b/>
@@ -1501,22 +1878,6 @@
         </w:tc>
       </w:tr>
     </w:tbl>
-    <w:p>
-      <w:pPr>
-        <w:rPr>
-          <w:b/>
-          <w:bCs/>
-        </w:rPr>
-      </w:pPr>
-    </w:p>
-    <w:p>
-      <w:pPr>
-        <w:rPr>
-          <w:b/>
-          <w:bCs/>
-        </w:rPr>
-      </w:pPr>
-    </w:p>
     <w:p>
       <w:pPr>
         <w:rPr>
@@ -1768,7 +2129,23 @@
                 <w:b/>
                 <w:bCs/>
               </w:rPr>
-              <w:t>Tavor Kadoori/13</w:t>
+              <w:t xml:space="preserve">Tavor </w:t>
+            </w:r>
+            <w:proofErr w:type="spellStart"/>
+            <w:r>
+              <w:rPr>
+                <w:b/>
+                <w:bCs/>
+              </w:rPr>
+              <w:t>Kadoori</w:t>
+            </w:r>
+            <w:proofErr w:type="spellEnd"/>
+            <w:r>
+              <w:rPr>
+                <w:b/>
+                <w:bCs/>
+              </w:rPr>
+              <w:t>/13</w:t>
             </w:r>
           </w:p>
         </w:tc>
@@ -1853,7 +2230,23 @@
                 <w:b/>
                 <w:bCs/>
               </w:rPr>
-              <w:t>Afula Ner Haemek/16</w:t>
+              <w:t xml:space="preserve">Afula Ner </w:t>
+            </w:r>
+            <w:proofErr w:type="spellStart"/>
+            <w:r>
+              <w:rPr>
+                <w:b/>
+                <w:bCs/>
+              </w:rPr>
+              <w:t>Haemek</w:t>
+            </w:r>
+            <w:proofErr w:type="spellEnd"/>
+            <w:r>
+              <w:rPr>
+                <w:b/>
+                <w:bCs/>
+              </w:rPr>
+              <w:t>/16</w:t>
             </w:r>
           </w:p>
         </w:tc>
@@ -2018,12 +2411,131 @@
                 <w:bCs/>
               </w:rPr>
             </w:pPr>
-            <w:r>
-              <w:rPr>
-                <w:b/>
-                <w:bCs/>
-              </w:rPr>
-              <w:t>Newe Yaa’r/186</w:t>
+            <w:proofErr w:type="spellStart"/>
+            <w:r>
+              <w:rPr>
+                <w:b/>
+                <w:bCs/>
+              </w:rPr>
+              <w:t>TelAviv</w:t>
+            </w:r>
+            <w:proofErr w:type="spellEnd"/>
+            <w:r>
+              <w:rPr>
+                <w:b/>
+                <w:bCs/>
+              </w:rPr>
+              <w:t xml:space="preserve"> Coast/178</w:t>
+            </w:r>
+          </w:p>
+        </w:tc>
+        <w:tc>
+          <w:tcPr>
+            <w:tcW w:w="1449" w:type="dxa"/>
+          </w:tcPr>
+          <w:p>
+            <w:r>
+              <w:t>5.4</w:t>
+            </w:r>
+          </w:p>
+        </w:tc>
+        <w:tc>
+          <w:tcPr>
+            <w:tcW w:w="1451" w:type="dxa"/>
+          </w:tcPr>
+          <w:p>
+            <w:r>
+              <w:t>41</w:t>
+            </w:r>
+          </w:p>
+        </w:tc>
+        <w:tc>
+          <w:tcPr>
+            <w:tcW w:w="1444" w:type="dxa"/>
+          </w:tcPr>
+          <w:p>
+            <w:r>
+              <w:t>18.6</w:t>
+            </w:r>
+          </w:p>
+        </w:tc>
+        <w:tc>
+          <w:tcPr>
+            <w:tcW w:w="1457" w:type="dxa"/>
+          </w:tcPr>
+          <w:p>
+            <w:r>
+              <w:t>18.2</w:t>
+            </w:r>
+          </w:p>
+        </w:tc>
+        <w:tc>
+          <w:tcPr>
+            <w:tcW w:w="1475" w:type="dxa"/>
+          </w:tcPr>
+          <w:p>
+            <w:r>
+              <w:t>8</w:t>
+            </w:r>
+          </w:p>
+        </w:tc>
+        <w:tc>
+          <w:tcPr>
+            <w:tcW w:w="1476" w:type="dxa"/>
+          </w:tcPr>
+          <w:p>
+            <w:r>
+              <w:t>100</w:t>
+            </w:r>
+          </w:p>
+        </w:tc>
+      </w:tr>
+      <w:tr>
+        <w:trPr>
+          <w:trHeight w:val="586"/>
+        </w:trPr>
+        <w:tc>
+          <w:tcPr>
+            <w:tcW w:w="1688" w:type="dxa"/>
+          </w:tcPr>
+          <w:p>
+            <w:pPr>
+              <w:rPr>
+                <w:b/>
+                <w:bCs/>
+              </w:rPr>
+            </w:pPr>
+            <w:proofErr w:type="spellStart"/>
+            <w:r>
+              <w:rPr>
+                <w:b/>
+                <w:bCs/>
+              </w:rPr>
+              <w:t>Newe</w:t>
+            </w:r>
+            <w:proofErr w:type="spellEnd"/>
+            <w:r>
+              <w:rPr>
+                <w:b/>
+                <w:bCs/>
+              </w:rPr>
+              <w:t xml:space="preserve"> </w:t>
+            </w:r>
+            <w:proofErr w:type="spellStart"/>
+            <w:r>
+              <w:rPr>
+                <w:b/>
+                <w:bCs/>
+              </w:rPr>
+              <w:t>Yaa’r</w:t>
+            </w:r>
+            <w:proofErr w:type="spellEnd"/>
+            <w:r>
+              <w:rPr>
+                <w:b/>
+                <w:bCs/>
+              </w:rPr>
+              <w:t>/186</w:t>
             </w:r>
           </w:p>
         </w:tc>

</xml_diff>